<commit_message>
Add numbered Excel source and attrition ledger
</commit_message>
<xml_diff>
--- a/group_10_draft_1.docx
+++ b/group_10_draft_1.docx
@@ -38,7 +38,7 @@
         </w:rPr>
       </w:pPr>
       <w:r>
-        <w:t>DRAFT 1: METHODS &amp; EMPIRICAL RESULTS</w:t>
+        <w:t>DRAFT 1: EXCEL DATA AUDIT &amp; ANALYSIS READINESS</w:t>
       </w:r>
     </w:p>
     <w:p>
@@ -2512,7 +2512,7 @@
         <w:pStyle w:val="NormalWeb"/>
       </w:pPr>
       <w:r>
-        <w:t>The selected workbook has one worksheet with 73 rows and 15 columns. It records three site totals, four demographic frequency summaries, and 72 item-frequency rows (63 practice-item labels and nine CA-item labels). These are workbook tallies, not respondent records. The item response bins are labelled 1 through 5.</w:t>
+        <w:t>Numbered source and attrition ledger (Excel-only; counts below describe workbook contents, not the full survey process):</w:t>
       </w:r>
     </w:p>
     <w:p>
@@ -2524,7 +2524,7 @@
         </w:numPr>
       </w:pPr>
       <w:r>
-        <w:t>Workbook source: DATASET/dataset.xlsx; Sheet1; 73 × 15 cells. No respondent-level table or record identifier is present.</w:t>
+        <w:t>1. Selected source: DATASET/dataset.xlsx, Sheet1, 73 rows × 15 columns; this is the sole analysis workbook used in this draft.</w:t>
       </w:r>
     </w:p>
     <w:p>
@@ -2542,7 +2542,7 @@
         </w:numPr>
       </w:pPr>
       <w:r>
-        <w:t>Item frequency rows: 72 (63 practice-item rows and nine CA-item rows, as labelled in the workbook); response categories 1–5 are tallied in separate columns.</w:t>
+        <w:t>2. Recorded summaries: three site totals (TESHI 144, Presby 50, seminary 72; sum 266), four demographic frequency summaries, and 72 item-frequency rows (63 practice-item labels and nine CA-item labels). Five response bins (1–5) are recorded for each item.</w:t>
       </w:r>
     </w:p>
     <w:p>
@@ -2559,7 +2559,7 @@
         </w:numPr>
       </w:pPr>
       <w:r>
-        <w:t>The five-bin frequencies sum to each displayed item total for all 72 item rows. Those item totals range from 671 to 907, so the workbook does not establish one common respondent denominator.</w:t>
+        <w:t>3. Frequency check: for all 72 item rows, the five bin counts sum to the displayed row total. Item totals range from 671 to 907. Demographic summary totals are study level 510, age group 490, gender 398, and computer confidence 950. These marginal totals do not establish a common respondent denominator.</w:t>
       </w:r>
     </w:p>
     <w:p>
@@ -2576,7 +2576,7 @@
         </w:numPr>
       </w:pPr>
       <w:r>
-        <w:t>Respondent records: none are represented as one-row-per-student records in the selected workbook. Joint item responses, missingness by respondent, and school membership by respondent are unavailable.</w:t>
+        <w:t>4. Respondent-level rows represented in this workbook: none. It has no student record identifiers, linked item-response vectors, respondent-level missingness, or respondent-to-school mapping. This means zero respondent rows are present in this file; it does not mean zero questionnaires were collected.</w:t>
       </w:r>
     </w:p>
     <w:p>
@@ -2599,7 +2599,7 @@
         </w:numPr>
       </w:pPr>
       <w:r>
-        <w:t>Aggregation: the workbook already contains marginal frequency summaries. Its aggregation procedure and the mapping from counts to unique respondents are not documented in the file; no further aggregation or cohort reconstruction is assumed.</w:t>
+        <w:t>5. Survey attrition fields: questionnaires distributed, returned, incomplete exclusions, and final valid respondent count are not recorded in the selected Excel workbook. Those four counts, and the conversion from collected questionnaires to workbook tallies, are therefore not calculable from the permitted source. No attrition counts or cohort reconstruction are inferred.</w:t>
       </w:r>
     </w:p>
     <w:p>
@@ -2620,7 +2620,7 @@
         </w:numPr>
       </w:pPr>
       <w:r>
-        <w:t>Demographic count totals shown in the workbook are 510 for study level, 490 for age group, 398 for gender, and 950 for computer confidence; the three listed site counts sum to 266. These totals do not reconcile to a shared sample size. Final respondent $n$, exclusions, and school-group sizes cannot be established from this workbook.</w:t>
+        <w:t>The workbook’s aggregation procedure and the mapping from its frequency counts to unique respondents are undocumented. Accordingly, the site, demographic, and item summaries are reported as separate marginal counts and are not combined into a respondent cohort.</w:t>
       </w:r>
     </w:p>
     <w:p>
@@ -6140,14 +6140,7 @@
         </w:rPr>
       </w:pPr>
       <w:r>
-        <w:rPr>
-          <w:rFonts w:ascii="Times New Roman" w:eastAsia="Times New Roman" w:hAnsi="Times New Roman" w:cs="Times New Roman"/>
-          <w:b/>
-          <w:bCs/>
-          <w:sz w:val="36"/>
-          <w:szCs w:val="36"/>
-        </w:rPr>
-        <w:t>SECTION 4: EMPIRICAL RESULTS AND ANALYSIS</w:t>
+        <w:t>SECTION 4: EXCEL AUDIT RESULTS AND MODEL READINESS</w:t>
       </w:r>
     </w:p>
     <w:p>

</xml_diff>

<commit_message>
Select CTT as provisional measurement framework
</commit_message>
<xml_diff>
--- a/group_10_draft_1.docx
+++ b/group_10_draft_1.docx
@@ -1717,7 +1717,7 @@
         </w:rPr>
       </w:pPr>
       <w:r>
-        <w:t>The Excel workbook provides item labels and aggregate response frequencies but no respondent-level records or construct documentation. It therefore cannot establish a theory-to-item mapping, reliability, dimensionality, or causal explanation. The theoretical interpretation is left unresolved from this source alone.</w:t>
+        <w:t>Theoretical framework — Classical Test Theory (CTT): This study adopts CTT as its provisional measurement framework for the questionnaire’s recorded practice domains. CTT treats an observed score as comprising a true-score component and measurement error (Himelfarb, 2019). This measurement focus is more appropriate to the available item-frequency structure than Protection Motivation Theory, which would require measures of threat appraisal and coping appraisal that are not documented in the selected workbook. The seven practice-domain headings are retained as labels recorded in the Excel source; no item-to-domain mapping beyond those recorded labels is inferred. Because the workbook contains marginal frequencies rather than linked student responses, CTT is a conceptual framing only: score reliability, item covariance, dimensionality, and domain redundancy cannot be estimated here.</w:t>
       </w:r>
     </w:p>
     <w:p>
@@ -9108,29 +9108,31 @@
     </w:p>
     <w:p>
       <w:r>
-        <w:t>Theory diagnosis: the selected Excel workbook contains labels and marginal frequencies only. It does not document construct definitions, item-to-theory mapping, or respondent-level measurements. A theory-to-variable interpretation cannot be established from this source alone; no theory-specific result is claimed.</w:t>
-      </w:r>
-    </w:p>
-    <w:p>
-      <w:r>
-        <w:t>Instrument or construct equivalence is not assessed from the aggregate workbook. The item codes and seven practice-domain headings are retained as recorded in Excel, but no external instrument equivalence or validation claim is made.</w:t>
-      </w:r>
-    </w:p>
-    <w:p>
-      <w:r>
-        <w:t>Measurement checks such as internal consistency, factor structure, and respondent-level reliability require linked item responses. They cannot be calculated from the workbook’s marginal frequencies.</w:t>
-      </w:r>
-    </w:p>
-    <w:p>
-      <w:r>
-        <w:t>Status: Theory selection, construct mapping, and measurement validity remain unresolved under the Excel-only source restriction. No coefficient sparsity or domain redundancy interpretation is made.</w:t>
+        <w:t>Theory redirection: Classical Test Theory (CTT) is adopted as the provisional measurement framework, not as an empirically tested model. The selected Excel workbook contains item labels and marginal frequencies but no respondent-level scores or documented construct definitions. It therefore cannot support a theory-to-item validation, reliability estimate, dimensionality analysis, or causal explanation.</w:t>
+      </w:r>
+    </w:p>
+    <w:p>
+      <w:r>
+        <w:t>The seven practice-domain headings are retained as recorded in the workbook. Item-to-domain equivalence and instrument equivalence are not independently assessed; no external validation claim is made.</w:t>
+      </w:r>
+    </w:p>
+    <w:p>
+      <w:r>
+        <w:t>CTT reliability and measurement analyses require linked item responses and respondent-level score variation. They cannot be calculated from the workbook’s marginal frequencies.</w:t>
+      </w:r>
+    </w:p>
+    <w:p>
+      <w:r>
+        <w:t>Status: CTT is the selected conceptual measurement framework; its measurement properties remain untested under the Excel-only source restriction. No coefficient sparsity or domain redundancy interpretation is made.</w:t>
       </w:r>
     </w:p>
     <w:p>
       <w:pPr>
         <w:ind w:left="360" w:hanging="360"/>
       </w:pPr>
-      <w:r/>
+      <w:r>
+        <w:t>Reference: Himelfarb, I. (2019). A primer on standardized testing: History, measurement, classical test theory, item response theory, and equating. Journal of Chiropractic Education, 33(2), 151–163. https://doi.org/10.7899/JCE-18-22</w:t>
+      </w:r>
     </w:p>
     <w:p>
       <w:pPr>

</xml_diff>

<commit_message>
Align audit draft with conditional model scope
</commit_message>
<xml_diff>
--- a/group_10_draft_1.docx
+++ b/group_10_draft_1.docx
@@ -106,22 +106,7 @@
             <w:hideMark/>
           </w:tcPr>
           <w:p>
-            <w:pPr>
-              <w:spacing w:after="480" w:line="240" w:lineRule="auto"/>
-              <w:rPr>
-                <w:rFonts w:ascii="Times New Roman" w:eastAsia="Times New Roman" w:hAnsi="Times New Roman" w:cs="Times New Roman"/>
-                <w:sz w:val="24"/>
-                <w:szCs w:val="24"/>
-              </w:rPr>
-            </w:pPr>
-            <w:r>
-              <w:rPr>
-                <w:rFonts w:ascii="Times New Roman" w:eastAsia="Times New Roman" w:hAnsi="Times New Roman" w:cs="Times New Roman"/>
-                <w:b/>
-                <w:bCs/>
-                <w:sz w:val="24"/>
-                <w:szCs w:val="24"/>
-              </w:rPr>
+            <w:r>
               <w:t>Field</w:t>
             </w:r>
           </w:p>
@@ -145,22 +130,7 @@
             <w:hideMark/>
           </w:tcPr>
           <w:p>
-            <w:pPr>
-              <w:spacing w:after="480" w:line="240" w:lineRule="auto"/>
-              <w:rPr>
-                <w:rFonts w:ascii="Times New Roman" w:eastAsia="Times New Roman" w:hAnsi="Times New Roman" w:cs="Times New Roman"/>
-                <w:sz w:val="24"/>
-                <w:szCs w:val="24"/>
-              </w:rPr>
-            </w:pPr>
-            <w:r>
-              <w:rPr>
-                <w:rFonts w:ascii="Times New Roman" w:eastAsia="Times New Roman" w:hAnsi="Times New Roman" w:cs="Times New Roman"/>
-                <w:b/>
-                <w:bCs/>
-                <w:sz w:val="24"/>
-                <w:szCs w:val="24"/>
-              </w:rPr>
+            <w:r>
               <w:t>Entry</w:t>
             </w:r>
           </w:p>
@@ -184,22 +154,7 @@
             <w:hideMark/>
           </w:tcPr>
           <w:p>
-            <w:pPr>
-              <w:spacing w:after="480" w:line="240" w:lineRule="auto"/>
-              <w:rPr>
-                <w:rFonts w:ascii="Times New Roman" w:eastAsia="Times New Roman" w:hAnsi="Times New Roman" w:cs="Times New Roman"/>
-                <w:sz w:val="24"/>
-                <w:szCs w:val="24"/>
-              </w:rPr>
-            </w:pPr>
-            <w:r>
-              <w:rPr>
-                <w:rFonts w:ascii="Times New Roman" w:eastAsia="Times New Roman" w:hAnsi="Times New Roman" w:cs="Times New Roman"/>
-                <w:b/>
-                <w:bCs/>
-                <w:sz w:val="24"/>
-                <w:szCs w:val="24"/>
-              </w:rPr>
+            <w:r>
               <w:t>Field</w:t>
             </w:r>
           </w:p>
@@ -223,22 +178,7 @@
             <w:hideMark/>
           </w:tcPr>
           <w:p>
-            <w:pPr>
-              <w:spacing w:after="480" w:line="240" w:lineRule="auto"/>
-              <w:rPr>
-                <w:rFonts w:ascii="Times New Roman" w:eastAsia="Times New Roman" w:hAnsi="Times New Roman" w:cs="Times New Roman"/>
-                <w:sz w:val="24"/>
-                <w:szCs w:val="24"/>
-              </w:rPr>
-            </w:pPr>
-            <w:r>
-              <w:rPr>
-                <w:rFonts w:ascii="Times New Roman" w:eastAsia="Times New Roman" w:hAnsi="Times New Roman" w:cs="Times New Roman"/>
-                <w:b/>
-                <w:bCs/>
-                <w:sz w:val="24"/>
-                <w:szCs w:val="24"/>
-              </w:rPr>
+            <w:r>
               <w:t>Entry</w:t>
             </w:r>
           </w:p>
@@ -306,96 +246,9 @@
             <w:hideMark/>
           </w:tcPr>
           <w:p>
-            <w:pPr>
-              <w:spacing w:after="480" w:line="240" w:lineRule="auto"/>
-              <w:rPr>
-                <w:rFonts w:ascii="Times New Roman" w:eastAsia="Times New Roman" w:hAnsi="Times New Roman" w:cs="Times New Roman"/>
-                <w:sz w:val="24"/>
-                <w:szCs w:val="24"/>
-              </w:rPr>
-            </w:pPr>
-            <w:proofErr w:type="spellStart"/>
-            <w:r>
-              <w:rPr>
-                <w:rFonts w:ascii="Times New Roman" w:eastAsia="Times New Roman" w:hAnsi="Times New Roman" w:cs="Times New Roman"/>
-                <w:sz w:val="24"/>
-                <w:szCs w:val="24"/>
-              </w:rPr>
-              <w:t>Nahimatu</w:t>
-            </w:r>
-            <w:proofErr w:type="spellEnd"/>
-            <w:r>
-              <w:rPr>
-                <w:rFonts w:ascii="Times New Roman" w:eastAsia="Times New Roman" w:hAnsi="Times New Roman" w:cs="Times New Roman"/>
-                <w:sz w:val="24"/>
-                <w:szCs w:val="24"/>
-              </w:rPr>
-              <w:t xml:space="preserve"> </w:t>
-            </w:r>
-            <w:proofErr w:type="spellStart"/>
-            <w:r>
-              <w:rPr>
-                <w:rFonts w:ascii="Times New Roman" w:eastAsia="Times New Roman" w:hAnsi="Times New Roman" w:cs="Times New Roman"/>
-                <w:sz w:val="24"/>
-                <w:szCs w:val="24"/>
-              </w:rPr>
-              <w:t>Ayippey</w:t>
-            </w:r>
-            <w:proofErr w:type="spellEnd"/>
-            <w:r>
-              <w:rPr>
-                <w:rFonts w:ascii="Times New Roman" w:eastAsia="Times New Roman" w:hAnsi="Times New Roman" w:cs="Times New Roman"/>
-                <w:sz w:val="24"/>
-                <w:szCs w:val="24"/>
-              </w:rPr>
-              <w:t xml:space="preserve">, Joseph </w:t>
-            </w:r>
-            <w:proofErr w:type="spellStart"/>
-            <w:r>
-              <w:rPr>
-                <w:rFonts w:ascii="Times New Roman" w:eastAsia="Times New Roman" w:hAnsi="Times New Roman" w:cs="Times New Roman"/>
-                <w:sz w:val="24"/>
-                <w:szCs w:val="24"/>
-              </w:rPr>
-              <w:t>Edem</w:t>
-            </w:r>
-            <w:proofErr w:type="spellEnd"/>
-            <w:r>
-              <w:rPr>
-                <w:rFonts w:ascii="Times New Roman" w:eastAsia="Times New Roman" w:hAnsi="Times New Roman" w:cs="Times New Roman"/>
-                <w:sz w:val="24"/>
-                <w:szCs w:val="24"/>
-              </w:rPr>
-              <w:t xml:space="preserve"> </w:t>
-            </w:r>
-            <w:proofErr w:type="spellStart"/>
-            <w:r>
-              <w:rPr>
-                <w:rFonts w:ascii="Times New Roman" w:eastAsia="Times New Roman" w:hAnsi="Times New Roman" w:cs="Times New Roman"/>
-                <w:sz w:val="24"/>
-                <w:szCs w:val="24"/>
-              </w:rPr>
-              <w:t>Anyigbah</w:t>
-            </w:r>
-            <w:proofErr w:type="spellEnd"/>
-            <w:r>
-              <w:rPr>
-                <w:rFonts w:ascii="Times New Roman" w:eastAsia="Times New Roman" w:hAnsi="Times New Roman" w:cs="Times New Roman"/>
-                <w:sz w:val="24"/>
-                <w:szCs w:val="24"/>
-              </w:rPr>
-              <w:t xml:space="preserve">, Grace Badu Gyimah </w:t>
-            </w:r>
-          </w:p>
-          <w:p>
-            <w:pPr>
-              <w:spacing w:after="480" w:line="240" w:lineRule="auto"/>
-              <w:rPr>
-                <w:rFonts w:ascii="Times New Roman" w:eastAsia="Times New Roman" w:hAnsi="Times New Roman" w:cs="Times New Roman"/>
-                <w:sz w:val="24"/>
-                <w:szCs w:val="24"/>
-              </w:rPr>
-            </w:pPr>
+            <w:r>
+              <w:t>Nahimatu Ayippey, Joseph Edem Anyigbah, Grace Badu Gyimah</w:t>
+            </w:r>
           </w:p>
         </w:tc>
         <w:tc>
@@ -456,32 +309,9 @@
             <w:hideMark/>
           </w:tcPr>
           <w:p>
-            <w:pPr>
-              <w:spacing w:after="480" w:line="240" w:lineRule="auto"/>
-              <w:rPr>
-                <w:rFonts w:ascii="Times New Roman" w:eastAsia="Times New Roman" w:hAnsi="Times New Roman" w:cs="Times New Roman"/>
-                <w:sz w:val="24"/>
-                <w:szCs w:val="24"/>
-              </w:rPr>
-            </w:pPr>
-            <w:r>
-              <w:rPr>
-                <w:rFonts w:ascii="Times New Roman" w:eastAsia="Times New Roman" w:hAnsi="Times New Roman" w:cs="Times New Roman"/>
-                <w:sz w:val="24"/>
-                <w:szCs w:val="24"/>
-              </w:rPr>
-              <w:t xml:space="preserve">6515224 / 6507924 / 6515324 </w:t>
-            </w:r>
-          </w:p>
-          <w:p>
-            <w:pPr>
-              <w:spacing w:after="480" w:line="240" w:lineRule="auto"/>
-              <w:rPr>
-                <w:rFonts w:ascii="Times New Roman" w:eastAsia="Times New Roman" w:hAnsi="Times New Roman" w:cs="Times New Roman"/>
-                <w:sz w:val="24"/>
-                <w:szCs w:val="24"/>
-              </w:rPr>
-            </w:pPr>
+            <w:r>
+              <w:t>6515224 / 6507924 / 6515324</w:t>
+            </w:r>
           </w:p>
         </w:tc>
       </w:tr>
@@ -548,7 +378,7 @@
           </w:tcPr>
           <w:p>
             <w:r>
-              <w:t>PLANNED; NOT FITTED</w:t>
+              <w:t>COMPLETED — Excel frequency audit; predictive models not fitted</w:t>
             </w:r>
           </w:p>
         </w:tc>
@@ -611,7 +441,7 @@
           </w:tcPr>
           <w:p>
             <w:r>
-              <w:t>FACTORIAL COMPARISON</w:t>
+              <w:t>Not applicable to this audit; no factorial model run</w:t>
             </w:r>
           </w:p>
         </w:tc>
@@ -679,7 +509,7 @@
           </w:tcPr>
           <w:p>
             <w:r>
-              <w:t>No empirical claim; predictive evaluation planned only if supported by valid Excel rows</w:t>
+              <w:t>Descriptive workbook frequencies only; no predictive or generalisation claim</w:t>
             </w:r>
           </w:p>
         </w:tc>
@@ -741,32 +571,9 @@
             <w:hideMark/>
           </w:tcPr>
           <w:p>
-            <w:pPr>
-              <w:spacing w:after="480" w:line="240" w:lineRule="auto"/>
-              <w:rPr>
-                <w:rFonts w:ascii="Times New Roman" w:eastAsia="Times New Roman" w:hAnsi="Times New Roman" w:cs="Times New Roman"/>
-                <w:sz w:val="24"/>
-                <w:szCs w:val="24"/>
-              </w:rPr>
-            </w:pPr>
-            <w:r>
-              <w:rPr>
-                <w:rFonts w:ascii="Times New Roman" w:eastAsia="Times New Roman" w:hAnsi="Times New Roman" w:cs="Times New Roman"/>
-                <w:sz w:val="24"/>
-                <w:szCs w:val="24"/>
-              </w:rPr>
-              <w:t xml:space="preserve">SINGLE-SOURCE </w:t>
-            </w:r>
-          </w:p>
-          <w:p>
-            <w:pPr>
-              <w:spacing w:after="480" w:line="240" w:lineRule="auto"/>
-              <w:rPr>
-                <w:rFonts w:ascii="Times New Roman" w:eastAsia="Times New Roman" w:hAnsi="Times New Roman" w:cs="Times New Roman"/>
-                <w:sz w:val="24"/>
-                <w:szCs w:val="24"/>
-              </w:rPr>
-            </w:pPr>
+            <w:r>
+              <w:t>SINGLE-SOURCE</w:t>
+            </w:r>
           </w:p>
         </w:tc>
       </w:tr>
@@ -832,32 +639,9 @@
             <w:hideMark/>
           </w:tcPr>
           <w:p>
-            <w:pPr>
-              <w:spacing w:after="480" w:line="240" w:lineRule="auto"/>
-              <w:rPr>
-                <w:rFonts w:ascii="Times New Roman" w:eastAsia="Times New Roman" w:hAnsi="Times New Roman" w:cs="Times New Roman"/>
-                <w:sz w:val="24"/>
-                <w:szCs w:val="24"/>
-              </w:rPr>
-            </w:pPr>
-            <w:r>
-              <w:rPr>
-                <w:rFonts w:ascii="Times New Roman" w:eastAsia="Times New Roman" w:hAnsi="Times New Roman" w:cs="Times New Roman"/>
-                <w:sz w:val="24"/>
-                <w:szCs w:val="24"/>
-              </w:rPr>
-              <w:t xml:space="preserve">ML </w:t>
-            </w:r>
-          </w:p>
-          <w:p>
-            <w:pPr>
-              <w:spacing w:after="480" w:line="240" w:lineRule="auto"/>
-              <w:rPr>
-                <w:rFonts w:ascii="Times New Roman" w:eastAsia="Times New Roman" w:hAnsi="Times New Roman" w:cs="Times New Roman"/>
-                <w:sz w:val="24"/>
-                <w:szCs w:val="24"/>
-              </w:rPr>
-            </w:pPr>
+            <w:r>
+              <w:t>Excel Data Audit</w:t>
+            </w:r>
           </w:p>
         </w:tc>
         <w:tc>
@@ -918,32 +702,9 @@
             <w:hideMark/>
           </w:tcPr>
           <w:p>
-            <w:pPr>
-              <w:spacing w:after="480" w:line="240" w:lineRule="auto"/>
-              <w:rPr>
-                <w:rFonts w:ascii="Times New Roman" w:eastAsia="Times New Roman" w:hAnsi="Times New Roman" w:cs="Times New Roman"/>
-                <w:sz w:val="24"/>
-                <w:szCs w:val="24"/>
-              </w:rPr>
-            </w:pPr>
-            <w:r>
-              <w:rPr>
-                <w:rFonts w:ascii="Times New Roman" w:eastAsia="Times New Roman" w:hAnsi="Times New Roman" w:cs="Times New Roman"/>
-                <w:sz w:val="24"/>
-                <w:szCs w:val="24"/>
-              </w:rPr>
-              <w:t xml:space="preserve">YES </w:t>
-            </w:r>
-          </w:p>
-          <w:p>
-            <w:pPr>
-              <w:spacing w:after="480" w:line="240" w:lineRule="auto"/>
-              <w:rPr>
-                <w:rFonts w:ascii="Times New Roman" w:eastAsia="Times New Roman" w:hAnsi="Times New Roman" w:cs="Times New Roman"/>
-                <w:sz w:val="24"/>
-                <w:szCs w:val="24"/>
-              </w:rPr>
-            </w:pPr>
+            <w:r>
+              <w:t>YES</w:t>
+            </w:r>
           </w:p>
         </w:tc>
       </w:tr>
@@ -970,23 +731,8 @@
             <w:hideMark/>
           </w:tcPr>
           <w:p>
-            <w:pPr>
-              <w:spacing w:after="480" w:line="240" w:lineRule="auto"/>
-              <w:rPr>
-                <w:rFonts w:ascii="Times New Roman" w:eastAsia="Times New Roman" w:hAnsi="Times New Roman" w:cs="Times New Roman"/>
-                <w:sz w:val="24"/>
-                <w:szCs w:val="24"/>
-              </w:rPr>
-            </w:pPr>
-            <w:r>
-              <w:rPr>
-                <w:rFonts w:ascii="Times New Roman" w:eastAsia="Times New Roman" w:hAnsi="Times New Roman" w:cs="Times New Roman"/>
-                <w:b/>
-                <w:bCs/>
-                <w:sz w:val="24"/>
-                <w:szCs w:val="24"/>
-              </w:rPr>
-              <w:t>Date Submitted</w:t>
+            <w:r>
+              <w:t>Revision Date</w:t>
             </w:r>
           </w:p>
         </w:tc>
@@ -1009,32 +755,9 @@
             <w:hideMark/>
           </w:tcPr>
           <w:p>
-            <w:pPr>
-              <w:spacing w:after="480" w:line="240" w:lineRule="auto"/>
-              <w:rPr>
-                <w:rFonts w:ascii="Times New Roman" w:eastAsia="Times New Roman" w:hAnsi="Times New Roman" w:cs="Times New Roman"/>
-                <w:sz w:val="24"/>
-                <w:szCs w:val="24"/>
-              </w:rPr>
-            </w:pPr>
-            <w:r>
-              <w:rPr>
-                <w:rFonts w:ascii="Times New Roman" w:eastAsia="Times New Roman" w:hAnsi="Times New Roman" w:cs="Times New Roman"/>
-                <w:sz w:val="24"/>
-                <w:szCs w:val="24"/>
-              </w:rPr>
-              <w:t xml:space="preserve">August 12, 2026 </w:t>
-            </w:r>
-          </w:p>
-          <w:p>
-            <w:pPr>
-              <w:spacing w:after="480" w:line="240" w:lineRule="auto"/>
-              <w:rPr>
-                <w:rFonts w:ascii="Times New Roman" w:eastAsia="Times New Roman" w:hAnsi="Times New Roman" w:cs="Times New Roman"/>
-                <w:sz w:val="24"/>
-                <w:szCs w:val="24"/>
-              </w:rPr>
-            </w:pPr>
+            <w:r>
+              <w:t>October 13, 2026</w:t>
+            </w:r>
           </w:p>
         </w:tc>
         <w:tc>
@@ -1096,7 +819,7 @@
           </w:tcPr>
           <w:p>
             <w:r>
-              <w:t>Held-out R² / RMSE</w:t>
+              <w:t>Workbook structure, recorded counts, and five-bin sum reconciliation</w:t>
             </w:r>
           </w:p>
         </w:tc>
@@ -1164,7 +887,7 @@
           </w:tcPr>
           <w:p>
             <w:r>
-              <w:t>Not selected; Draft 0 notes IEEE / Elsevier format</w:t>
+              <w:t>Not specified in supplied project materials</w:t>
             </w:r>
           </w:p>
         </w:tc>
@@ -1227,7 +950,7 @@
           </w:tcPr>
           <w:p>
             <w:r>
-              <w:t>Planned paired seed-mean comparison; not run</w:t>
+              <w:t>Not applicable; no inferential test or model comparison was run</w:t>
             </w:r>
           </w:p>
         </w:tc>
@@ -1296,7 +1019,7 @@
           </w:tcPr>
           <w:p>
             <w:r>
-              <w:t>5 seeds × school-grouped folds; not run</w:t>
+              <w:t>Not applicable; no model runs or validation folds</w:t>
             </w:r>
           </w:p>
         </w:tc>
@@ -1358,32 +1081,9 @@
             <w:hideMark/>
           </w:tcPr>
           <w:p>
-            <w:pPr>
-              <w:spacing w:after="480" w:line="240" w:lineRule="auto"/>
-              <w:rPr>
-                <w:rFonts w:ascii="Times New Roman" w:eastAsia="Times New Roman" w:hAnsi="Times New Roman" w:cs="Times New Roman"/>
-                <w:sz w:val="24"/>
-                <w:szCs w:val="24"/>
-              </w:rPr>
-            </w:pPr>
-            <w:r>
-              <w:rPr>
-                <w:rFonts w:ascii="Times New Roman" w:eastAsia="Times New Roman" w:hAnsi="Times New Roman" w:cs="Times New Roman"/>
-                <w:sz w:val="24"/>
-                <w:szCs w:val="24"/>
-              </w:rPr>
-              <w:t xml:space="preserve">42, 123, 456, 789, 1010 </w:t>
-            </w:r>
-          </w:p>
-          <w:p>
-            <w:pPr>
-              <w:spacing w:after="480" w:line="240" w:lineRule="auto"/>
-              <w:rPr>
-                <w:rFonts w:ascii="Times New Roman" w:eastAsia="Times New Roman" w:hAnsi="Times New Roman" w:cs="Times New Roman"/>
-                <w:sz w:val="24"/>
-                <w:szCs w:val="24"/>
-              </w:rPr>
-            </w:pPr>
+            <w:r>
+              <w:t>Not applicable; no stochastic model runs</w:t>
+            </w:r>
           </w:p>
         </w:tc>
       </w:tr>
@@ -2040,6 +1740,14 @@
         </w:rPr>
       </w:pPr>
     </w:p>
+    <w:p>
+      <w:pPr>
+        <w:jc w:val="center"/>
+      </w:pPr>
+      <w:r>
+        <w:t>Table 1. Excel Workbook Provenance and Analysis Readiness</w:t>
+      </w:r>
+    </w:p>
     <w:tbl>
       <w:tblPr>
         <w:tblW w:w="0" w:type="auto"/>
@@ -2512,7 +2220,7 @@
         <w:pStyle w:val="NormalWeb"/>
       </w:pPr>
       <w:r>
-        <w:t>Numbered source and attrition ledger (Excel-only; counts below describe workbook contents, not the full survey process):</w:t>
+        <w:t>Numbered source and attrition ledger (Excel-only; these are source-record statuses, not reconstructed survey counts):</w:t>
       </w:r>
     </w:p>
     <w:p>
@@ -2524,7 +2232,7 @@
         </w:numPr>
       </w:pPr>
       <w:r>
-        <w:t>1. Selected source: DATASET/dataset.xlsx, Sheet1, 73 rows × 15 columns; this is the sole analysis workbook used in this draft.</w:t>
+        <w:t>1. Workbook audited: DATASET/dataset.xlsx, Sheet1, 73 rows × 15 columns; selected as the sole analysis source.</w:t>
       </w:r>
     </w:p>
     <w:p>
@@ -2542,7 +2250,7 @@
         </w:numPr>
       </w:pPr>
       <w:r>
-        <w:t>2. Recorded summaries: three site totals (TESHI 144, Presby 50, seminary 72; sum 266), four demographic frequency summaries, and 72 item-frequency rows (63 practice-item labels and nine CA-item labels). Five response bins (1–5) are recorded for each item.</w:t>
+        <w:t>2. Questionnaires distributed/collected and returned: these flow counts are not recorded in the selected workbook and cannot be established from it.</w:t>
       </w:r>
     </w:p>
     <w:p>
@@ -2559,7 +2267,7 @@
         </w:numPr>
       </w:pPr>
       <w:r>
-        <w:t>3. Frequency check: for all 72 item rows, the five bin counts sum to the displayed row total. Item totals range from 671 to 907. Demographic summary totals are study level 510, age group 490, gender 398, and computer confidence 950. These marginal totals do not establish a common respondent denominator.</w:t>
+        <w:t>3. Incomplete responses and exclusions: no respondent-level completeness or exclusion log is present; excluded counts and reasons are not recorded.</w:t>
       </w:r>
     </w:p>
     <w:p>
@@ -2576,7 +2284,7 @@
         </w:numPr>
       </w:pPr>
       <w:r>
-        <w:t>4. Respondent-level rows represented in this workbook: none. It has no student record identifiers, linked item-response vectors, respondent-level missingness, or respondent-to-school mapping. This means zero respondent rows are present in this file; it does not mean zero questionnaires were collected.</w:t>
+        <w:t>4. Aggregation: the workbook contains 72 item-frequency rows with five response bins per row. The source does not document the aggregation, deduplication, or respondent-to-count rule.</w:t>
       </w:r>
     </w:p>
     <w:p>
@@ -2599,7 +2307,7 @@
         </w:numPr>
       </w:pPr>
       <w:r>
-        <w:t>5. Survey attrition fields: questionnaires distributed, returned, incomplete exclusions, and final valid respondent count are not recorded in the selected Excel workbook. Those four counts, and the conversion from collected questionnaires to workbook tallies, are therefore not calculable from the permitted source. No attrition counts or cohort reconstruction are inferred.</w:t>
+        <w:t>5. Cohort vectors: no one-row-per-student response vectors or linked identifiers are represented in this workbook. The number of row-level records present is zero; this describes the file structure and does not mean zero questionnaires were collected.</w:t>
       </w:r>
     </w:p>
     <w:p>
@@ -2620,7 +2328,7 @@
         </w:numPr>
       </w:pPr>
       <w:r>
-        <w:t>The workbook’s aggregation procedure and the mapping from its frequency counts to unique respondents are undocumented. Accordingly, the site, demographic, and item summaries are reported as separate marginal counts and are not combined into a respondent cohort.</w:t>
+        <w:t>6. Final valid respondent count: not determinable from this workbook. It has no common respondent denominator; site, demographic, and item totals are separate marginals and do not provide a reconciled final n.</w:t>
       </w:r>
     </w:p>
     <w:p>
@@ -2913,7 +2621,7 @@
         <w:jc w:val="center"/>
       </w:pPr>
       <w:r>
-        <w:t>Table 1. Excel Field Inventory and Recorded Frequency Counts (selected workbook only)</w:t>
+        <w:t>Table 2. Excel Field Inventory and Recorded Frequency Counts (selected workbook only)</w:t>
       </w:r>
     </w:p>
     <w:tbl>
@@ -4033,7 +3741,7 @@
     </w:p>
     <w:p>
       <w:r>
-        <w:t>Table 2. Excel Workbook Provenance and Analysis Readiness</w:t>
+        <w:t>Table 3. Workbook Audit Status and Respondent Data Availability</w:t>
       </w:r>
     </w:p>
     <w:tbl>
@@ -4501,6 +4209,11 @@
       </w:r>
     </w:p>
     <w:p>
+      <w:r>
+        <w:t>Scope boundary: This manuscript reports an Excel frequency audit only. The conditional design in M11–M19 is retained as future-work documentation; it is not a method executed or a result of the present study.</w:t>
+      </w:r>
+    </w:p>
+    <w:p>
       <w:pPr>
         <w:spacing w:before="100" w:beforeAutospacing="1" w:after="100" w:afterAutospacing="1" w:line="240" w:lineRule="auto"/>
         <w:outlineLvl w:val="2"/>
@@ -4513,6 +4226,59 @@
         </w:rPr>
       </w:pPr>
       <w:r>
+        <w:t>M11. Baseline Selection for a Conditional Future Respondent-Level Study</w:t>
+      </w:r>
+    </w:p>
+    <w:p>
+      <w:pPr>
+        <w:spacing w:after="0" w:line="240" w:lineRule="auto"/>
+        <w:rPr>
+          <w:rFonts w:ascii="Times New Roman" w:eastAsia="Times New Roman" w:hAnsi="Times New Roman" w:cs="Times New Roman"/>
+          <w:sz w:val="24"/>
+          <w:szCs w:val="24"/>
+        </w:rPr>
+      </w:pPr>
+      <w:r>
+        <w:t>No baseline is fitted in the present Excel audit. If valid respondent-level records are later available, OLS will serve as the unpenalized baseline for the pre-specified four-arm comparison; no baseline result is claimed here.</w:t>
+      </w:r>
+    </w:p>
+    <w:p>
+      <w:pPr>
+        <w:spacing w:after="0" w:line="240" w:lineRule="auto"/>
+        <w:rPr>
+          <w:rFonts w:ascii="Times New Roman" w:eastAsia="Times New Roman" w:hAnsi="Times New Roman" w:cs="Times New Roman"/>
+          <w:sz w:val="24"/>
+          <w:szCs w:val="24"/>
+        </w:rPr>
+      </w:pPr>
+    </w:p>
+    <w:p>
+      <w:pPr>
+        <w:spacing w:after="0" w:line="240" w:lineRule="auto"/>
+        <w:rPr>
+          <w:rFonts w:ascii="Times New Roman" w:eastAsia="Times New Roman" w:hAnsi="Times New Roman" w:cs="Times New Roman"/>
+          <w:sz w:val="24"/>
+          <w:szCs w:val="24"/>
+        </w:rPr>
+      </w:pPr>
+    </w:p>
+    <w:p>
+      <w:pPr>
+        <w:spacing w:after="0" w:line="240" w:lineRule="auto"/>
+        <w:rPr>
+          <w:rFonts w:ascii="Times New Roman" w:eastAsia="Times New Roman" w:hAnsi="Times New Roman" w:cs="Times New Roman"/>
+          <w:sz w:val="24"/>
+          <w:szCs w:val="24"/>
+        </w:rPr>
+      </w:pPr>
+      <w:r>
+        <w:t>The workbook identifies 13 candidate source fields: study_level, age_group, gender, computer_confidence, and CA1–CA9. It does not provide these as linked respondent-level columns and it has no program_of_study field. Site counts are not respondent-linked validation groups, so an exact model matrix and school-grouped partitions cannot be constructed from this file.</w:t>
+      </w:r>
+    </w:p>
+    <w:p>
+      <w:pPr>
+        <w:spacing w:before="100" w:beforeAutospacing="1" w:after="100" w:afterAutospacing="1" w:line="240" w:lineRule="auto"/>
+        <w:outlineLvl w:val="2"/>
         <w:rPr>
           <w:rFonts w:ascii="Times New Roman" w:eastAsia="Times New Roman" w:hAnsi="Times New Roman" w:cs="Times New Roman"/>
           <w:b/>
@@ -4520,385 +4286,76 @@
           <w:sz w:val="27"/>
           <w:szCs w:val="27"/>
         </w:rPr>
-        <w:t>M11. Baseline Selection and Justification</w:t>
-      </w:r>
-    </w:p>
-    <w:p>
-      <w:pPr>
-        <w:spacing w:after="0" w:line="240" w:lineRule="auto"/>
-        <w:rPr>
-          <w:rFonts w:ascii="Times New Roman" w:eastAsia="Times New Roman" w:hAnsi="Times New Roman" w:cs="Times New Roman"/>
-          <w:sz w:val="24"/>
-          <w:szCs w:val="24"/>
-        </w:rPr>
-      </w:pPr>
-      <w:r>
-        <w:t>The requested OLS, LASSO, and ridge comparison is not fit from the selected workbook because it lacks respondent-level rows and a calculable individual outcome. The six comparison arms remain a proposed design only; no baseline or proposed model result is available.</w:t>
-      </w:r>
-    </w:p>
-    <w:p>
-      <w:pPr>
-        <w:spacing w:after="0" w:line="240" w:lineRule="auto"/>
-        <w:rPr>
-          <w:rFonts w:ascii="Times New Roman" w:eastAsia="Times New Roman" w:hAnsi="Times New Roman" w:cs="Times New Roman"/>
-          <w:sz w:val="24"/>
-          <w:szCs w:val="24"/>
-        </w:rPr>
-      </w:pPr>
-    </w:p>
-    <w:p>
-      <w:pPr>
-        <w:spacing w:after="0" w:line="240" w:lineRule="auto"/>
-        <w:rPr>
-          <w:rFonts w:ascii="Times New Roman" w:eastAsia="Times New Roman" w:hAnsi="Times New Roman" w:cs="Times New Roman"/>
-          <w:sz w:val="24"/>
-          <w:szCs w:val="24"/>
-        </w:rPr>
-      </w:pPr>
-    </w:p>
-    <w:p>
-      <w:pPr>
-        <w:spacing w:after="0" w:line="240" w:lineRule="auto"/>
-        <w:rPr>
-          <w:rFonts w:ascii="Times New Roman" w:eastAsia="Times New Roman" w:hAnsi="Times New Roman" w:cs="Times New Roman"/>
-          <w:sz w:val="24"/>
-          <w:szCs w:val="24"/>
-        </w:rPr>
-      </w:pPr>
-      <w:r>
-        <w:t>The workbook identifies 13 candidate source fields: study_level, age_group, gender, computer_confidence, and CA1–CA9. It does not provide these as linked respondent-level columns and it has no program_of_study field. Site counts are not respondent-linked validation groups, so an exact model matrix and school-grouped partitions cannot be constructed from this file.</w:t>
-      </w:r>
-    </w:p>
-    <w:p>
-      <w:pPr>
-        <w:spacing w:before="100" w:beforeAutospacing="1" w:after="100" w:afterAutospacing="1" w:line="240" w:lineRule="auto"/>
-        <w:outlineLvl w:val="2"/>
-        <w:rPr>
-          <w:rFonts w:ascii="Times New Roman" w:eastAsia="Times New Roman" w:hAnsi="Times New Roman" w:cs="Times New Roman"/>
-          <w:b/>
-          <w:bCs/>
-          <w:sz w:val="27"/>
-          <w:szCs w:val="27"/>
-        </w:rPr>
-      </w:pPr>
-      <w:r>
-        <w:rPr>
-          <w:rFonts w:ascii="Times New Roman" w:eastAsia="Times New Roman" w:hAnsi="Times New Roman" w:cs="Times New Roman"/>
-          <w:b/>
-          <w:bCs/>
-          <w:sz w:val="27"/>
-          <w:szCs w:val="27"/>
-        </w:rPr>
-        <w:t>M12. Proposed Model Specification and Engineering Operation</w:t>
-      </w:r>
-    </w:p>
-    <w:p>
-      <w:pPr>
-        <w:spacing w:after="0" w:line="240" w:lineRule="auto"/>
-        <w:rPr>
-          <w:rFonts w:ascii="Times New Roman" w:eastAsia="Times New Roman" w:hAnsi="Times New Roman" w:cs="Times New Roman"/>
-          <w:sz w:val="24"/>
-          <w:szCs w:val="24"/>
-        </w:rPr>
-      </w:pPr>
-      <w:r>
-        <w:t>Model Status: Not estimable from the selected aggregate-frequency workbook; no model has been fitted.</w:t>
-      </w:r>
-    </w:p>
-    <w:p>
-      <w:pPr>
-        <w:spacing w:after="0" w:line="240" w:lineRule="auto"/>
-        <w:rPr>
-          <w:rFonts w:ascii="Times New Roman" w:eastAsia="Times New Roman" w:hAnsi="Times New Roman" w:cs="Times New Roman"/>
-          <w:sz w:val="24"/>
-          <w:szCs w:val="24"/>
-        </w:rPr>
-      </w:pPr>
-    </w:p>
-    <w:p>
-      <w:pPr>
-        <w:spacing w:after="0" w:line="240" w:lineRule="auto"/>
-        <w:rPr>
-          <w:rFonts w:ascii="Times New Roman" w:eastAsia="Times New Roman" w:hAnsi="Times New Roman" w:cs="Times New Roman"/>
-          <w:sz w:val="24"/>
-          <w:szCs w:val="24"/>
-        </w:rPr>
-      </w:pPr>
-      <w:r>
-        <w:t>Comparison: the OLS/LASSO raw and out-of-fold target-encoding arms and ridge comparators are specified as a future design only. The current workbook cannot supply their required input rows.</w:t>
-      </w:r>
-    </w:p>
-    <w:p>
-      <w:pPr>
-        <w:spacing w:after="0" w:line="240" w:lineRule="auto"/>
-        <w:rPr>
-          <w:rFonts w:ascii="Times New Roman" w:eastAsia="Times New Roman" w:hAnsi="Times New Roman" w:cs="Times New Roman"/>
-          <w:sz w:val="24"/>
-          <w:szCs w:val="24"/>
-        </w:rPr>
-      </w:pPr>
-    </w:p>
-    <w:p>
-      <w:pPr>
-        <w:spacing w:after="0" w:line="240" w:lineRule="auto"/>
-        <w:rPr>
-          <w:rFonts w:ascii="Times New Roman" w:eastAsia="Times New Roman" w:hAnsi="Times New Roman" w:cs="Times New Roman"/>
-          <w:sz w:val="24"/>
-          <w:szCs w:val="24"/>
-        </w:rPr>
-      </w:pPr>
-      <w:r>
-        <w:rPr>
-          <w:rFonts w:ascii="Times New Roman" w:eastAsia="Times New Roman" w:hAnsi="Times New Roman" w:cs="Times New Roman"/>
-          <w:sz w:val="24"/>
-          <w:szCs w:val="24"/>
-        </w:rPr>
-        <w:t>The unpenalized OLS objective function:</w:t>
-      </w:r>
-    </w:p>
-    <w:p>
-      <w:pPr>
-        <w:spacing w:after="0" w:line="240" w:lineRule="auto"/>
-        <w:rPr>
-          <w:rFonts w:ascii="Times New Roman" w:eastAsia="Times New Roman" w:hAnsi="Times New Roman" w:cs="Times New Roman"/>
-          <w:sz w:val="24"/>
-          <w:szCs w:val="24"/>
-        </w:rPr>
-      </w:pPr>
-    </w:p>
-    <w:p>
-      <w:pPr>
-        <w:spacing w:after="0" w:line="240" w:lineRule="auto"/>
-        <w:rPr>
-          <w:rFonts w:ascii="Times New Roman" w:eastAsia="Times New Roman" w:hAnsi="Times New Roman" w:cs="Times New Roman"/>
-          <w:sz w:val="24"/>
-          <w:szCs w:val="24"/>
-        </w:rPr>
-      </w:pPr>
-      <w:r>
-        <w:rPr>
-          <w:rFonts w:ascii="Times New Roman" w:eastAsia="Times New Roman" w:hAnsi="Times New Roman" w:cs="Times New Roman"/>
-          <w:sz w:val="24"/>
-          <w:szCs w:val="24"/>
-        </w:rPr>
-        <w:t>$$L_{\text{base</w:t>
-      </w:r>
-      <w:proofErr w:type="gramStart"/>
-      <w:r>
-        <w:rPr>
-          <w:rFonts w:ascii="Times New Roman" w:eastAsia="Times New Roman" w:hAnsi="Times New Roman" w:cs="Times New Roman"/>
-          <w:sz w:val="24"/>
-          <w:szCs w:val="24"/>
-        </w:rPr>
-        <w:t>}}(</w:t>
-      </w:r>
-      <w:proofErr w:type="gramEnd"/>
-      <w:r>
-        <w:rPr>
-          <w:rFonts w:ascii="Times New Roman" w:eastAsia="Times New Roman" w:hAnsi="Times New Roman" w:cs="Times New Roman"/>
-          <w:sz w:val="24"/>
-          <w:szCs w:val="24"/>
-        </w:rPr>
-        <w:t xml:space="preserve">\beta) = \sum_{i=1}^{n} \left( </w:t>
-      </w:r>
-      <w:proofErr w:type="spellStart"/>
-      <w:r>
-        <w:rPr>
-          <w:rFonts w:ascii="Times New Roman" w:eastAsia="Times New Roman" w:hAnsi="Times New Roman" w:cs="Times New Roman"/>
-          <w:sz w:val="24"/>
-          <w:szCs w:val="24"/>
-        </w:rPr>
-        <w:t>y_i</w:t>
-      </w:r>
-      <w:proofErr w:type="spellEnd"/>
-      <w:r>
-        <w:rPr>
-          <w:rFonts w:ascii="Times New Roman" w:eastAsia="Times New Roman" w:hAnsi="Times New Roman" w:cs="Times New Roman"/>
-          <w:sz w:val="24"/>
-          <w:szCs w:val="24"/>
-        </w:rPr>
-        <w:t xml:space="preserve"> - \beta_0 - \sum_{j=1}^{p} X_{</w:t>
-      </w:r>
-      <w:proofErr w:type="spellStart"/>
-      <w:r>
-        <w:rPr>
-          <w:rFonts w:ascii="Times New Roman" w:eastAsia="Times New Roman" w:hAnsi="Times New Roman" w:cs="Times New Roman"/>
-          <w:sz w:val="24"/>
-          <w:szCs w:val="24"/>
-        </w:rPr>
-        <w:t>ij</w:t>
-      </w:r>
-      <w:proofErr w:type="spellEnd"/>
-      <w:r>
-        <w:rPr>
-          <w:rFonts w:ascii="Times New Roman" w:eastAsia="Times New Roman" w:hAnsi="Times New Roman" w:cs="Times New Roman"/>
-          <w:sz w:val="24"/>
-          <w:szCs w:val="24"/>
-        </w:rPr>
-        <w:t>}\</w:t>
-      </w:r>
-      <w:proofErr w:type="spellStart"/>
-      <w:r>
-        <w:rPr>
-          <w:rFonts w:ascii="Times New Roman" w:eastAsia="Times New Roman" w:hAnsi="Times New Roman" w:cs="Times New Roman"/>
-          <w:sz w:val="24"/>
-          <w:szCs w:val="24"/>
-        </w:rPr>
-        <w:t>beta_j</w:t>
-      </w:r>
-      <w:proofErr w:type="spellEnd"/>
-      <w:r>
-        <w:rPr>
-          <w:rFonts w:ascii="Times New Roman" w:eastAsia="Times New Roman" w:hAnsi="Times New Roman" w:cs="Times New Roman"/>
-          <w:sz w:val="24"/>
-          <w:szCs w:val="24"/>
-        </w:rPr>
-        <w:t xml:space="preserve"> \right)^2$$</w:t>
-      </w:r>
-    </w:p>
-    <w:p>
-      <w:pPr>
-        <w:spacing w:after="0" w:line="240" w:lineRule="auto"/>
-        <w:rPr>
-          <w:rFonts w:ascii="Times New Roman" w:eastAsia="Times New Roman" w:hAnsi="Times New Roman" w:cs="Times New Roman"/>
-          <w:sz w:val="24"/>
-          <w:szCs w:val="24"/>
-        </w:rPr>
-      </w:pPr>
-      <w:r>
-        <w:t>No model objective was fitted to this workbook. The equations below describe the proposed comparison only; they are not evidence of a completed model run.</w:t>
-      </w:r>
-    </w:p>
-    <w:p>
-      <w:pPr>
-        <w:spacing w:after="0" w:line="240" w:lineRule="auto"/>
-        <w:rPr>
-          <w:rFonts w:ascii="Times New Roman" w:eastAsia="Times New Roman" w:hAnsi="Times New Roman" w:cs="Times New Roman"/>
-          <w:sz w:val="24"/>
-          <w:szCs w:val="24"/>
-        </w:rPr>
-      </w:pPr>
-    </w:p>
-    <w:p>
-      <w:pPr>
-        <w:spacing w:after="0" w:line="240" w:lineRule="auto"/>
-        <w:rPr>
-          <w:rFonts w:ascii="Times New Roman" w:eastAsia="Times New Roman" w:hAnsi="Times New Roman" w:cs="Times New Roman"/>
-          <w:sz w:val="24"/>
-          <w:szCs w:val="24"/>
-        </w:rPr>
-      </w:pPr>
-      <w:r>
-        <w:rPr>
-          <w:rFonts w:ascii="Times New Roman" w:eastAsia="Times New Roman" w:hAnsi="Times New Roman" w:cs="Times New Roman"/>
-          <w:sz w:val="24"/>
-          <w:szCs w:val="24"/>
-        </w:rPr>
-        <w:t>$$L_{\text{new</w:t>
-      </w:r>
-      <w:proofErr w:type="gramStart"/>
-      <w:r>
-        <w:rPr>
-          <w:rFonts w:ascii="Times New Roman" w:eastAsia="Times New Roman" w:hAnsi="Times New Roman" w:cs="Times New Roman"/>
-          <w:sz w:val="24"/>
-          <w:szCs w:val="24"/>
-        </w:rPr>
-        <w:t>}}(</w:t>
-      </w:r>
-      <w:proofErr w:type="gramEnd"/>
-      <w:r>
-        <w:rPr>
-          <w:rFonts w:ascii="Times New Roman" w:eastAsia="Times New Roman" w:hAnsi="Times New Roman" w:cs="Times New Roman"/>
-          <w:sz w:val="24"/>
-          <w:szCs w:val="24"/>
-        </w:rPr>
-        <w:t xml:space="preserve">\beta) = \frac{1}{2n} \sum_{i=1}^{n} \left( </w:t>
-      </w:r>
-      <w:proofErr w:type="spellStart"/>
-      <w:r>
-        <w:rPr>
-          <w:rFonts w:ascii="Times New Roman" w:eastAsia="Times New Roman" w:hAnsi="Times New Roman" w:cs="Times New Roman"/>
-          <w:sz w:val="24"/>
-          <w:szCs w:val="24"/>
-        </w:rPr>
-        <w:t>y_i</w:t>
-      </w:r>
-      <w:proofErr w:type="spellEnd"/>
-      <w:r>
-        <w:rPr>
-          <w:rFonts w:ascii="Times New Roman" w:eastAsia="Times New Roman" w:hAnsi="Times New Roman" w:cs="Times New Roman"/>
-          <w:sz w:val="24"/>
-          <w:szCs w:val="24"/>
-        </w:rPr>
-        <w:t xml:space="preserve"> - \beta_0 - \sum_{j=1}^{p} X_{</w:t>
-      </w:r>
-      <w:proofErr w:type="spellStart"/>
-      <w:r>
-        <w:rPr>
-          <w:rFonts w:ascii="Times New Roman" w:eastAsia="Times New Roman" w:hAnsi="Times New Roman" w:cs="Times New Roman"/>
-          <w:sz w:val="24"/>
-          <w:szCs w:val="24"/>
-        </w:rPr>
-        <w:t>ij</w:t>
-      </w:r>
-      <w:proofErr w:type="spellEnd"/>
-      <w:r>
-        <w:rPr>
-          <w:rFonts w:ascii="Times New Roman" w:eastAsia="Times New Roman" w:hAnsi="Times New Roman" w:cs="Times New Roman"/>
-          <w:sz w:val="24"/>
-          <w:szCs w:val="24"/>
-        </w:rPr>
-        <w:t>}\</w:t>
-      </w:r>
-      <w:proofErr w:type="spellStart"/>
-      <w:r>
-        <w:rPr>
-          <w:rFonts w:ascii="Times New Roman" w:eastAsia="Times New Roman" w:hAnsi="Times New Roman" w:cs="Times New Roman"/>
-          <w:sz w:val="24"/>
-          <w:szCs w:val="24"/>
-        </w:rPr>
-        <w:t>beta_j</w:t>
-      </w:r>
-      <w:proofErr w:type="spellEnd"/>
-      <w:r>
-        <w:rPr>
-          <w:rFonts w:ascii="Times New Roman" w:eastAsia="Times New Roman" w:hAnsi="Times New Roman" w:cs="Times New Roman"/>
-          <w:sz w:val="24"/>
-          <w:szCs w:val="24"/>
-        </w:rPr>
-        <w:t xml:space="preserve"> \right)^2 + \lambda \sum_{j=1}^{p} \vert{}\</w:t>
-      </w:r>
-      <w:proofErr w:type="spellStart"/>
-      <w:r>
-        <w:rPr>
-          <w:rFonts w:ascii="Times New Roman" w:eastAsia="Times New Roman" w:hAnsi="Times New Roman" w:cs="Times New Roman"/>
-          <w:sz w:val="24"/>
-          <w:szCs w:val="24"/>
-        </w:rPr>
-        <w:t>beta_j</w:t>
-      </w:r>
-      <w:proofErr w:type="spellEnd"/>
-      <w:r>
-        <w:rPr>
-          <w:rFonts w:ascii="Times New Roman" w:eastAsia="Times New Roman" w:hAnsi="Times New Roman" w:cs="Times New Roman"/>
-          <w:sz w:val="24"/>
-          <w:szCs w:val="24"/>
-        </w:rPr>
-        <w:t>\vert{}$$</w:t>
-      </w:r>
-    </w:p>
-    <w:p>
-      <w:pPr>
-        <w:spacing w:after="0" w:line="240" w:lineRule="auto"/>
-        <w:rPr>
-          <w:rFonts w:ascii="Times New Roman" w:eastAsia="Times New Roman" w:hAnsi="Times New Roman" w:cs="Times New Roman"/>
-          <w:sz w:val="24"/>
-          <w:szCs w:val="24"/>
-        </w:rPr>
-      </w:pPr>
-      <w:r>
-        <w:t>The Draft 0 value $\lambda=0.00547$ is withdrawn. No penalty can be selected from aggregate marginal frequencies, and no coefficient path or model metric is available from the selected workbook.</w:t>
-      </w:r>
+      </w:pPr>
+      <w:r>
+        <w:t>M12. Conditional Future Model Specification (Not Executed in This Audit)</w:t>
+      </w:r>
+    </w:p>
+    <w:p>
+      <w:pPr>
+        <w:spacing w:after="0" w:line="240" w:lineRule="auto"/>
+        <w:rPr>
+          <w:rFonts w:ascii="Times New Roman" w:eastAsia="Times New Roman" w:hAnsi="Times New Roman" w:cs="Times New Roman"/>
+          <w:sz w:val="24"/>
+          <w:szCs w:val="24"/>
+        </w:rPr>
+      </w:pPr>
+      <w:r>
+        <w:t>This section records a future design only. It is not part of the analyses performed for this Excel audit; all four arms require linked respondent-level predictors, outcome values, and school identifiers.</w:t>
+      </w:r>
+    </w:p>
+    <w:p>
+      <w:pPr>
+        <w:spacing w:after="0" w:line="240" w:lineRule="auto"/>
+        <w:rPr>
+          <w:rFonts w:ascii="Times New Roman" w:eastAsia="Times New Roman" w:hAnsi="Times New Roman" w:cs="Times New Roman"/>
+          <w:sz w:val="24"/>
+          <w:szCs w:val="24"/>
+        </w:rPr>
+      </w:pPr>
+    </w:p>
+    <w:p>
+      <w:pPr>
+        <w:spacing w:after="0" w:line="240" w:lineRule="auto"/>
+        <w:rPr>
+          <w:rFonts w:ascii="Times New Roman" w:eastAsia="Times New Roman" w:hAnsi="Times New Roman" w:cs="Times New Roman"/>
+          <w:sz w:val="24"/>
+          <w:szCs w:val="24"/>
+        </w:rPr>
+      </w:pPr>
+      <w:r>
+        <w:t>The future comparison is limited to four matched arms: (1) OLS on raw features; (2) OLS with out-of-fold target encoding; (3) LASSO on raw features; and (4) LASSO with out-of-fold target encoding. Each arm must use identical outer folds and comparable tuning budgets. Standardization must be fitted within each training fold before LASSO. Any feature that mathematically composes TOTAL must be excluded from X. No arm has been fitted because the selected workbook contains marginal counts only.</w:t>
+      </w:r>
+    </w:p>
+    <w:p>
+      <w:pPr>
+        <w:spacing w:after="0" w:line="240" w:lineRule="auto"/>
+        <w:rPr>
+          <w:rFonts w:ascii="Times New Roman" w:eastAsia="Times New Roman" w:hAnsi="Times New Roman" w:cs="Times New Roman"/>
+          <w:sz w:val="24"/>
+          <w:szCs w:val="24"/>
+        </w:rPr>
+      </w:pPr>
+    </w:p>
+    <w:p>
+      <w:pPr>
+        <w:spacing w:after="0" w:line="240" w:lineRule="auto"/>
+        <w:rPr>
+          <w:rFonts w:ascii="Times New Roman" w:eastAsia="Times New Roman" w:hAnsi="Times New Roman" w:cs="Times New Roman"/>
+          <w:sz w:val="24"/>
+          <w:szCs w:val="24"/>
+        </w:rPr>
+      </w:pPr>
+    </w:p>
+    <w:p>
+      <w:pPr>
+        <w:spacing w:after="0" w:line="240" w:lineRule="auto"/>
+        <w:rPr>
+          <w:rFonts w:ascii="Times New Roman" w:eastAsia="Times New Roman" w:hAnsi="Times New Roman" w:cs="Times New Roman"/>
+          <w:sz w:val="24"/>
+          <w:szCs w:val="24"/>
+        </w:rPr>
+      </w:pPr>
     </w:p>
     <w:p>
       <w:pPr>
@@ -4922,532 +4379,6 @@
     </w:p>
     <w:p>
       <w:pPr>
-        <w:spacing w:after="0" w:line="240" w:lineRule="auto"/>
-        <w:rPr>
-          <w:rFonts w:ascii="Courier New" w:eastAsia="Times New Roman" w:hAnsi="Courier New" w:cs="Courier New"/>
-          <w:sz w:val="20"/>
-          <w:szCs w:val="20"/>
-        </w:rPr>
-      </w:pPr>
-      <w:r>
-        <w:rPr>
-          <w:noProof/>
-        </w:rPr>
-        <w:drawing>
-          <wp:anchor distT="0" distB="0" distL="114300" distR="114300" simplePos="0" relativeHeight="251663360" behindDoc="0" locked="0" layoutInCell="1" allowOverlap="1" wp14:anchorId="48D35A4F" wp14:editId="6F3C67C8">
-            <wp:simplePos x="0" y="0"/>
-            <wp:positionH relativeFrom="column">
-              <wp:posOffset>0</wp:posOffset>
-            </wp:positionH>
-            <wp:positionV relativeFrom="paragraph">
-              <wp:posOffset>144145</wp:posOffset>
-            </wp:positionV>
-            <wp:extent cx="6332402" cy="2205349"/>
-            <wp:effectExtent l="0" t="0" r="0" b="4451"/>
-            <wp:wrapSquare wrapText="bothSides"/>
-            <wp:docPr id="3" name="Image3"/>
-            <wp:cNvGraphicFramePr/>
-            <a:graphic xmlns:a="http://schemas.openxmlformats.org/drawingml/2006/main">
-              <a:graphicData uri="http://schemas.openxmlformats.org/drawingml/2006/picture">
-                <pic:pic xmlns:pic="http://schemas.openxmlformats.org/drawingml/2006/picture">
-                  <pic:nvPicPr>
-                    <pic:cNvPr id="0" name=""/>
-                    <pic:cNvPicPr/>
-                  </pic:nvPicPr>
-                  <pic:blipFill>
-                    <a:blip r:embed="rId7">
-                      <a:lum/>
-                      <a:alphaModFix/>
-                    </a:blip>
-                    <a:srcRect/>
-                    <a:stretch>
-                      <a:fillRect/>
-                    </a:stretch>
-                  </pic:blipFill>
-                  <pic:spPr>
-                    <a:xfrm>
-                      <a:off x="0" y="0"/>
-                      <a:ext cx="6332402" cy="2205349"/>
-                    </a:xfrm>
-                    <a:prstGeom prst="rect">
-                      <a:avLst/>
-                    </a:prstGeom>
-                  </pic:spPr>
-                </pic:pic>
-              </a:graphicData>
-            </a:graphic>
-          </wp:anchor>
-        </w:drawing>
-      </w:r>
-    </w:p>
-    <w:p>
-      <w:pPr>
-        <w:spacing w:after="0" w:line="240" w:lineRule="auto"/>
-        <w:rPr>
-          <w:rFonts w:ascii="Courier New" w:eastAsia="Times New Roman" w:hAnsi="Courier New" w:cs="Courier New"/>
-          <w:sz w:val="20"/>
-          <w:szCs w:val="20"/>
-        </w:rPr>
-      </w:pPr>
-    </w:p>
-    <w:p>
-      <w:pPr>
-        <w:spacing w:after="0" w:line="240" w:lineRule="auto"/>
-        <w:rPr>
-          <w:rFonts w:ascii="Times New Roman" w:eastAsia="Times New Roman" w:hAnsi="Times New Roman" w:cs="Times New Roman"/>
-          <w:sz w:val="24"/>
-          <w:szCs w:val="24"/>
-        </w:rPr>
-      </w:pPr>
-      <w:r>
-        <w:t>Figure 3. Proposed matched OLS, LASSO, and ridge comparison arms; the workbook does not currently support fitting them.</w:t>
-      </w:r>
-    </w:p>
-    <w:p>
-      <w:pPr>
-        <w:spacing w:after="0" w:line="240" w:lineRule="auto"/>
-        <w:rPr>
-          <w:rFonts w:ascii="Times New Roman" w:eastAsia="Times New Roman" w:hAnsi="Times New Roman" w:cs="Times New Roman"/>
-          <w:sz w:val="24"/>
-          <w:szCs w:val="24"/>
-        </w:rPr>
-      </w:pPr>
-    </w:p>
-    <w:p>
-      <w:pPr>
-        <w:tabs>
-          <w:tab w:val="left" w:pos="916"/>
-          <w:tab w:val="left" w:pos="1832"/>
-          <w:tab w:val="left" w:pos="2748"/>
-          <w:tab w:val="left" w:pos="3664"/>
-          <w:tab w:val="left" w:pos="4580"/>
-          <w:tab w:val="left" w:pos="5496"/>
-          <w:tab w:val="left" w:pos="6412"/>
-          <w:tab w:val="left" w:pos="7328"/>
-          <w:tab w:val="left" w:pos="8244"/>
-          <w:tab w:val="left" w:pos="9160"/>
-          <w:tab w:val="left" w:pos="10076"/>
-          <w:tab w:val="left" w:pos="10992"/>
-          <w:tab w:val="left" w:pos="11908"/>
-          <w:tab w:val="left" w:pos="12824"/>
-          <w:tab w:val="left" w:pos="13740"/>
-          <w:tab w:val="left" w:pos="14656"/>
-        </w:tabs>
-        <w:spacing w:after="0" w:line="240" w:lineRule="auto"/>
-        <w:rPr>
-          <w:rFonts w:ascii="Courier New" w:eastAsia="Times New Roman" w:hAnsi="Courier New" w:cs="Courier New"/>
-          <w:sz w:val="20"/>
-          <w:szCs w:val="20"/>
-        </w:rPr>
-      </w:pPr>
-      <w:r>
-        <w:rPr>
-          <w:rFonts w:ascii="Courier New" w:eastAsia="Times New Roman" w:hAnsi="Courier New" w:cs="Courier New"/>
-          <w:sz w:val="20"/>
-          <w:szCs w:val="20"/>
-        </w:rPr>
-        <w:t>Algorithm 1: Proposed OOF-TE-LASSO Execution Procedure</w:t>
-      </w:r>
-    </w:p>
-    <w:p>
-      <w:pPr>
-        <w:tabs>
-          <w:tab w:val="left" w:pos="916"/>
-          <w:tab w:val="left" w:pos="1832"/>
-          <w:tab w:val="left" w:pos="2748"/>
-          <w:tab w:val="left" w:pos="3664"/>
-          <w:tab w:val="left" w:pos="4580"/>
-          <w:tab w:val="left" w:pos="5496"/>
-          <w:tab w:val="left" w:pos="6412"/>
-          <w:tab w:val="left" w:pos="7328"/>
-          <w:tab w:val="left" w:pos="8244"/>
-          <w:tab w:val="left" w:pos="9160"/>
-          <w:tab w:val="left" w:pos="10076"/>
-          <w:tab w:val="left" w:pos="10992"/>
-          <w:tab w:val="left" w:pos="11908"/>
-          <w:tab w:val="left" w:pos="12824"/>
-          <w:tab w:val="left" w:pos="13740"/>
-          <w:tab w:val="left" w:pos="14656"/>
-        </w:tabs>
-        <w:spacing w:after="0" w:line="240" w:lineRule="auto"/>
-        <w:rPr>
-          <w:rFonts w:ascii="Courier New" w:eastAsia="Times New Roman" w:hAnsi="Courier New" w:cs="Courier New"/>
-          <w:sz w:val="20"/>
-          <w:szCs w:val="20"/>
-        </w:rPr>
-      </w:pPr>
-      <w:r>
-        <w:rPr>
-          <w:rFonts w:ascii="Courier New" w:eastAsia="Times New Roman" w:hAnsi="Courier New" w:cs="Courier New"/>
-          <w:sz w:val="20"/>
-          <w:szCs w:val="20"/>
-        </w:rPr>
-        <w:t>---------------------------------------------------------------------------------</w:t>
-      </w:r>
-    </w:p>
-    <w:p>
-      <w:pPr>
-        <w:tabs>
-          <w:tab w:val="left" w:pos="916"/>
-          <w:tab w:val="left" w:pos="1832"/>
-          <w:tab w:val="left" w:pos="2748"/>
-          <w:tab w:val="left" w:pos="3664"/>
-          <w:tab w:val="left" w:pos="4580"/>
-          <w:tab w:val="left" w:pos="5496"/>
-          <w:tab w:val="left" w:pos="6412"/>
-          <w:tab w:val="left" w:pos="7328"/>
-          <w:tab w:val="left" w:pos="8244"/>
-          <w:tab w:val="left" w:pos="9160"/>
-          <w:tab w:val="left" w:pos="10076"/>
-          <w:tab w:val="left" w:pos="10992"/>
-          <w:tab w:val="left" w:pos="11908"/>
-          <w:tab w:val="left" w:pos="12824"/>
-          <w:tab w:val="left" w:pos="13740"/>
-          <w:tab w:val="left" w:pos="14656"/>
-        </w:tabs>
-        <w:spacing w:after="0" w:line="240" w:lineRule="auto"/>
-        <w:rPr>
-          <w:rFonts w:ascii="Courier New" w:eastAsia="Times New Roman" w:hAnsi="Courier New" w:cs="Courier New"/>
-          <w:sz w:val="20"/>
-          <w:szCs w:val="20"/>
-        </w:rPr>
-      </w:pPr>
-      <w:r>
-        <w:t>Input: respondent-level records with verified outcome, predictors, and school grouping (not present in the selected workbook)</w:t>
-      </w:r>
-    </w:p>
-    <w:p>
-      <w:pPr>
-        <w:tabs>
-          <w:tab w:val="left" w:pos="916"/>
-          <w:tab w:val="left" w:pos="1832"/>
-          <w:tab w:val="left" w:pos="2748"/>
-          <w:tab w:val="left" w:pos="3664"/>
-          <w:tab w:val="left" w:pos="4580"/>
-          <w:tab w:val="left" w:pos="5496"/>
-          <w:tab w:val="left" w:pos="6412"/>
-          <w:tab w:val="left" w:pos="7328"/>
-          <w:tab w:val="left" w:pos="8244"/>
-          <w:tab w:val="left" w:pos="9160"/>
-          <w:tab w:val="left" w:pos="10076"/>
-          <w:tab w:val="left" w:pos="10992"/>
-          <w:tab w:val="left" w:pos="11908"/>
-          <w:tab w:val="left" w:pos="12824"/>
-          <w:tab w:val="left" w:pos="13740"/>
-          <w:tab w:val="left" w:pos="14656"/>
-        </w:tabs>
-        <w:spacing w:after="0" w:line="240" w:lineRule="auto"/>
-        <w:rPr>
-          <w:rFonts w:ascii="Courier New" w:eastAsia="Times New Roman" w:hAnsi="Courier New" w:cs="Courier New"/>
-          <w:sz w:val="20"/>
-          <w:szCs w:val="20"/>
-        </w:rPr>
-      </w:pPr>
-      <w:r>
-        <w:t>Output : Held-out predictions, fold metrics, tuning values, coefficients, and diagnostics</w:t>
-      </w:r>
-    </w:p>
-    <w:p>
-      <w:pPr>
-        <w:tabs>
-          <w:tab w:val="left" w:pos="916"/>
-          <w:tab w:val="left" w:pos="1832"/>
-          <w:tab w:val="left" w:pos="2748"/>
-          <w:tab w:val="left" w:pos="3664"/>
-          <w:tab w:val="left" w:pos="4580"/>
-          <w:tab w:val="left" w:pos="5496"/>
-          <w:tab w:val="left" w:pos="6412"/>
-          <w:tab w:val="left" w:pos="7328"/>
-          <w:tab w:val="left" w:pos="8244"/>
-          <w:tab w:val="left" w:pos="9160"/>
-          <w:tab w:val="left" w:pos="10076"/>
-          <w:tab w:val="left" w:pos="10992"/>
-          <w:tab w:val="left" w:pos="11908"/>
-          <w:tab w:val="left" w:pos="12824"/>
-          <w:tab w:val="left" w:pos="13740"/>
-          <w:tab w:val="left" w:pos="14656"/>
-        </w:tabs>
-        <w:spacing w:after="0" w:line="240" w:lineRule="auto"/>
-        <w:rPr>
-          <w:rFonts w:ascii="Courier New" w:eastAsia="Times New Roman" w:hAnsi="Courier New" w:cs="Courier New"/>
-          <w:sz w:val="20"/>
-          <w:szCs w:val="20"/>
-        </w:rPr>
-      </w:pPr>
-      <w:r>
-        <w:rPr>
-          <w:rFonts w:ascii="Courier New" w:eastAsia="Times New Roman" w:hAnsi="Courier New" w:cs="Courier New"/>
-          <w:sz w:val="20"/>
-          <w:szCs w:val="20"/>
-        </w:rPr>
-        <w:t>1: Initialize computational environment and load fixed seeds S;</w:t>
-      </w:r>
-    </w:p>
-    <w:p>
-      <w:pPr>
-        <w:tabs>
-          <w:tab w:val="left" w:pos="916"/>
-          <w:tab w:val="left" w:pos="1832"/>
-          <w:tab w:val="left" w:pos="2748"/>
-          <w:tab w:val="left" w:pos="3664"/>
-          <w:tab w:val="left" w:pos="4580"/>
-          <w:tab w:val="left" w:pos="5496"/>
-          <w:tab w:val="left" w:pos="6412"/>
-          <w:tab w:val="left" w:pos="7328"/>
-          <w:tab w:val="left" w:pos="8244"/>
-          <w:tab w:val="left" w:pos="9160"/>
-          <w:tab w:val="left" w:pos="10076"/>
-          <w:tab w:val="left" w:pos="10992"/>
-          <w:tab w:val="left" w:pos="11908"/>
-          <w:tab w:val="left" w:pos="12824"/>
-          <w:tab w:val="left" w:pos="13740"/>
-          <w:tab w:val="left" w:pos="14656"/>
-        </w:tabs>
-        <w:spacing w:after="0" w:line="240" w:lineRule="auto"/>
-        <w:rPr>
-          <w:rFonts w:ascii="Courier New" w:eastAsia="Times New Roman" w:hAnsi="Courier New" w:cs="Courier New"/>
-          <w:sz w:val="20"/>
-          <w:szCs w:val="20"/>
-        </w:rPr>
-      </w:pPr>
-      <w:r>
-        <w:rPr>
-          <w:rFonts w:ascii="Courier New" w:eastAsia="Times New Roman" w:hAnsi="Courier New" w:cs="Courier New"/>
-          <w:sz w:val="20"/>
-          <w:szCs w:val="20"/>
-        </w:rPr>
-        <w:t>2: For each independent run seed in S do:</w:t>
-      </w:r>
-    </w:p>
-    <w:p>
-      <w:pPr>
-        <w:tabs>
-          <w:tab w:val="left" w:pos="916"/>
-          <w:tab w:val="left" w:pos="1832"/>
-          <w:tab w:val="left" w:pos="2748"/>
-          <w:tab w:val="left" w:pos="3664"/>
-          <w:tab w:val="left" w:pos="4580"/>
-          <w:tab w:val="left" w:pos="5496"/>
-          <w:tab w:val="left" w:pos="6412"/>
-          <w:tab w:val="left" w:pos="7328"/>
-          <w:tab w:val="left" w:pos="8244"/>
-          <w:tab w:val="left" w:pos="9160"/>
-          <w:tab w:val="left" w:pos="10076"/>
-          <w:tab w:val="left" w:pos="10992"/>
-          <w:tab w:val="left" w:pos="11908"/>
-          <w:tab w:val="left" w:pos="12824"/>
-          <w:tab w:val="left" w:pos="13740"/>
-          <w:tab w:val="left" w:pos="14656"/>
-        </w:tabs>
-        <w:spacing w:after="0" w:line="240" w:lineRule="auto"/>
-        <w:rPr>
-          <w:rFonts w:ascii="Courier New" w:eastAsia="Times New Roman" w:hAnsi="Courier New" w:cs="Courier New"/>
-          <w:sz w:val="20"/>
-          <w:szCs w:val="20"/>
-        </w:rPr>
-      </w:pPr>
-      <w:r>
-        <w:t>3:     Construct school-grouped outer folds; hold out complete school groups;</w:t>
-      </w:r>
-    </w:p>
-    <w:p>
-      <w:pPr>
-        <w:tabs>
-          <w:tab w:val="left" w:pos="916"/>
-          <w:tab w:val="left" w:pos="1832"/>
-          <w:tab w:val="left" w:pos="2748"/>
-          <w:tab w:val="left" w:pos="3664"/>
-          <w:tab w:val="left" w:pos="4580"/>
-          <w:tab w:val="left" w:pos="5496"/>
-          <w:tab w:val="left" w:pos="6412"/>
-          <w:tab w:val="left" w:pos="7328"/>
-          <w:tab w:val="left" w:pos="8244"/>
-          <w:tab w:val="left" w:pos="9160"/>
-          <w:tab w:val="left" w:pos="10076"/>
-          <w:tab w:val="left" w:pos="10992"/>
-          <w:tab w:val="left" w:pos="11908"/>
-          <w:tab w:val="left" w:pos="12824"/>
-          <w:tab w:val="left" w:pos="13740"/>
-          <w:tab w:val="left" w:pos="14656"/>
-        </w:tabs>
-        <w:spacing w:after="0" w:line="240" w:lineRule="auto"/>
-        <w:rPr>
-          <w:rFonts w:ascii="Courier New" w:eastAsia="Times New Roman" w:hAnsi="Courier New" w:cs="Courier New"/>
-          <w:sz w:val="20"/>
-          <w:szCs w:val="20"/>
-        </w:rPr>
-      </w:pPr>
-      <w:r>
-        <w:t>4:     Fit imputation, encoding, and standardization on training partitions only;</w:t>
-      </w:r>
-    </w:p>
-    <w:p>
-      <w:pPr>
-        <w:tabs>
-          <w:tab w:val="left" w:pos="916"/>
-          <w:tab w:val="left" w:pos="1832"/>
-          <w:tab w:val="left" w:pos="2748"/>
-          <w:tab w:val="left" w:pos="3664"/>
-          <w:tab w:val="left" w:pos="4580"/>
-          <w:tab w:val="left" w:pos="5496"/>
-          <w:tab w:val="left" w:pos="6412"/>
-          <w:tab w:val="left" w:pos="7328"/>
-          <w:tab w:val="left" w:pos="8244"/>
-          <w:tab w:val="left" w:pos="9160"/>
-          <w:tab w:val="left" w:pos="10076"/>
-          <w:tab w:val="left" w:pos="10992"/>
-          <w:tab w:val="left" w:pos="11908"/>
-          <w:tab w:val="left" w:pos="12824"/>
-          <w:tab w:val="left" w:pos="13740"/>
-          <w:tab w:val="left" w:pos="14656"/>
-        </w:tabs>
-        <w:spacing w:after="0" w:line="240" w:lineRule="auto"/>
-        <w:rPr>
-          <w:rFonts w:ascii="Courier New" w:eastAsia="Times New Roman" w:hAnsi="Courier New" w:cs="Courier New"/>
-          <w:sz w:val="20"/>
-          <w:szCs w:val="20"/>
-        </w:rPr>
-      </w:pPr>
-      <w:r>
-        <w:t>5:     Fit OLS and LASSO with raw and out-of-fold target-encoded predictors;</w:t>
-      </w:r>
-    </w:p>
-    <w:p>
-      <w:pPr>
-        <w:tabs>
-          <w:tab w:val="left" w:pos="916"/>
-          <w:tab w:val="left" w:pos="1832"/>
-          <w:tab w:val="left" w:pos="2748"/>
-          <w:tab w:val="left" w:pos="3664"/>
-          <w:tab w:val="left" w:pos="4580"/>
-          <w:tab w:val="left" w:pos="5496"/>
-          <w:tab w:val="left" w:pos="6412"/>
-          <w:tab w:val="left" w:pos="7328"/>
-          <w:tab w:val="left" w:pos="8244"/>
-          <w:tab w:val="left" w:pos="9160"/>
-          <w:tab w:val="left" w:pos="10076"/>
-          <w:tab w:val="left" w:pos="10992"/>
-          <w:tab w:val="left" w:pos="11908"/>
-          <w:tab w:val="left" w:pos="12824"/>
-          <w:tab w:val="left" w:pos="13740"/>
-          <w:tab w:val="left" w:pos="14656"/>
-        </w:tabs>
-        <w:spacing w:after="0" w:line="240" w:lineRule="auto"/>
-        <w:rPr>
-          <w:rFonts w:ascii="Courier New" w:eastAsia="Times New Roman" w:hAnsi="Courier New" w:cs="Courier New"/>
-          <w:sz w:val="20"/>
-          <w:szCs w:val="20"/>
-        </w:rPr>
-      </w:pPr>
-      <w:r>
-        <w:t>6:     Tune LASSO and ridge penalties in inner school-grouped folds;</w:t>
-      </w:r>
-    </w:p>
-    <w:p>
-      <w:pPr>
-        <w:tabs>
-          <w:tab w:val="left" w:pos="916"/>
-          <w:tab w:val="left" w:pos="1832"/>
-          <w:tab w:val="left" w:pos="2748"/>
-          <w:tab w:val="left" w:pos="3664"/>
-          <w:tab w:val="left" w:pos="4580"/>
-          <w:tab w:val="left" w:pos="5496"/>
-          <w:tab w:val="left" w:pos="6412"/>
-          <w:tab w:val="left" w:pos="7328"/>
-          <w:tab w:val="left" w:pos="8244"/>
-          <w:tab w:val="left" w:pos="9160"/>
-          <w:tab w:val="left" w:pos="10076"/>
-          <w:tab w:val="left" w:pos="10992"/>
-          <w:tab w:val="left" w:pos="11908"/>
-          <w:tab w:val="left" w:pos="12824"/>
-          <w:tab w:val="left" w:pos="13740"/>
-          <w:tab w:val="left" w:pos="14656"/>
-        </w:tabs>
-        <w:spacing w:after="0" w:line="240" w:lineRule="auto"/>
-        <w:rPr>
-          <w:rFonts w:ascii="Courier New" w:eastAsia="Times New Roman" w:hAnsi="Courier New" w:cs="Courier New"/>
-          <w:sz w:val="20"/>
-          <w:szCs w:val="20"/>
-        </w:rPr>
-      </w:pPr>
-      <w:r>
-        <w:rPr>
-          <w:rFonts w:ascii="Courier New" w:eastAsia="Times New Roman" w:hAnsi="Courier New" w:cs="Courier New"/>
-          <w:sz w:val="20"/>
-          <w:szCs w:val="20"/>
-        </w:rPr>
-        <w:t>7: End For</w:t>
-      </w:r>
-    </w:p>
-    <w:p>
-      <w:pPr>
-        <w:tabs>
-          <w:tab w:val="left" w:pos="916"/>
-          <w:tab w:val="left" w:pos="1832"/>
-          <w:tab w:val="left" w:pos="2748"/>
-          <w:tab w:val="left" w:pos="3664"/>
-          <w:tab w:val="left" w:pos="4580"/>
-          <w:tab w:val="left" w:pos="5496"/>
-          <w:tab w:val="left" w:pos="6412"/>
-          <w:tab w:val="left" w:pos="7328"/>
-          <w:tab w:val="left" w:pos="8244"/>
-          <w:tab w:val="left" w:pos="9160"/>
-          <w:tab w:val="left" w:pos="10076"/>
-          <w:tab w:val="left" w:pos="10992"/>
-          <w:tab w:val="left" w:pos="11908"/>
-          <w:tab w:val="left" w:pos="12824"/>
-          <w:tab w:val="left" w:pos="13740"/>
-          <w:tab w:val="left" w:pos="14656"/>
-        </w:tabs>
-        <w:spacing w:after="0" w:line="240" w:lineRule="auto"/>
-        <w:rPr>
-          <w:rFonts w:ascii="Courier New" w:eastAsia="Times New Roman" w:hAnsi="Courier New" w:cs="Courier New"/>
-          <w:sz w:val="20"/>
-          <w:szCs w:val="20"/>
-        </w:rPr>
-      </w:pPr>
-      <w:r>
-        <w:t>8: Return held-out metrics, residuals, coefficients, and paired seed-level comparisons;</w:t>
-      </w:r>
-    </w:p>
-    <w:p>
-      <w:pPr>
-        <w:tabs>
-          <w:tab w:val="left" w:pos="916"/>
-          <w:tab w:val="left" w:pos="1832"/>
-          <w:tab w:val="left" w:pos="2748"/>
-          <w:tab w:val="left" w:pos="3664"/>
-          <w:tab w:val="left" w:pos="4580"/>
-          <w:tab w:val="left" w:pos="5496"/>
-          <w:tab w:val="left" w:pos="6412"/>
-          <w:tab w:val="left" w:pos="7328"/>
-          <w:tab w:val="left" w:pos="8244"/>
-          <w:tab w:val="left" w:pos="9160"/>
-          <w:tab w:val="left" w:pos="10076"/>
-          <w:tab w:val="left" w:pos="10992"/>
-          <w:tab w:val="left" w:pos="11908"/>
-          <w:tab w:val="left" w:pos="12824"/>
-          <w:tab w:val="left" w:pos="13740"/>
-          <w:tab w:val="left" w:pos="14656"/>
-        </w:tabs>
-        <w:spacing w:after="0" w:line="240" w:lineRule="auto"/>
-        <w:rPr>
-          <w:rFonts w:ascii="Courier New" w:eastAsia="Times New Roman" w:hAnsi="Courier New" w:cs="Courier New"/>
-          <w:sz w:val="20"/>
-          <w:szCs w:val="20"/>
-        </w:rPr>
-      </w:pPr>
-      <w:r>
-        <w:rPr>
-          <w:rFonts w:ascii="Courier New" w:eastAsia="Times New Roman" w:hAnsi="Courier New" w:cs="Courier New"/>
-          <w:sz w:val="20"/>
-          <w:szCs w:val="20"/>
-        </w:rPr>
-        <w:t>---------------------------------------------------------------------------------</w:t>
-      </w:r>
-    </w:p>
-    <w:p>
-      <w:pPr>
         <w:spacing w:before="100" w:beforeAutospacing="1" w:after="100" w:afterAutospacing="1" w:line="240" w:lineRule="auto"/>
         <w:outlineLvl w:val="2"/>
         <w:rPr>
@@ -5501,7 +4432,7 @@
         </w:rPr>
       </w:pPr>
       <w:r>
-        <w:t>If a valid respondent-level dataset becomes available, LASSO and ridge may be tuned within training folds using the same pre-specified grid and criterion. The selected workbook cannot support this tuning, so no penalty value is reported.</w:t>
+        <w:t>If valid respondent-level records become available, LASSO penalties may be tuned within training folds using the same pre-specified grid and criterion across the two LASSO arms. The selected workbook cannot support this tuning, so no penalty value or fold-wise penalty distribution is reported.</w:t>
       </w:r>
     </w:p>
     <w:p>
@@ -6059,7 +4990,7 @@
         </w:rPr>
       </w:pPr>
       <w:r>
-        <w:t>Baseline Currency Defence: OLS is the unpenalized comparator. Ridge is included to compare shrinkage without exact-zero feature selection; the raw and target-encoded arms separate representation effects from penalty effects.</w:t>
+        <w:t>Baseline and representation rationale for future work: OLS provides the unpenalized comparator, while LASSO tests the effect of an L1 penalty. Comparing raw and out-of-fold target-encoded versions separates representation effects from penalty effects. This four-arm rationale is prospective only; no arm has been fitted.</w:t>
       </w:r>
     </w:p>
     <w:p>
@@ -6243,6 +5174,54 @@
         </w:rPr>
       </w:pPr>
       <w:r>
+        <w:t>R2. Predictive Results: Not Produced in This Audit</w:t>
+      </w:r>
+    </w:p>
+    <w:p>
+      <w:pPr>
+        <w:spacing w:after="0" w:line="240" w:lineRule="auto"/>
+        <w:rPr>
+          <w:rFonts w:ascii="Times New Roman" w:eastAsia="Times New Roman" w:hAnsi="Times New Roman" w:cs="Times New Roman"/>
+          <w:sz w:val="24"/>
+          <w:szCs w:val="24"/>
+        </w:rPr>
+      </w:pPr>
+      <w:r>
+        <w:t>No predictive model was fitted, so this audit reports no R², MAE, RMSE, confidence interval, or model difference. Draft 0 performance values remain withdrawn.</w:t>
+      </w:r>
+    </w:p>
+    <w:p>
+      <w:pPr>
+        <w:spacing w:after="0" w:line="240" w:lineRule="auto"/>
+        <w:rPr>
+          <w:rFonts w:ascii="Times New Roman" w:eastAsia="Times New Roman" w:hAnsi="Times New Roman" w:cs="Times New Roman"/>
+          <w:sz w:val="24"/>
+          <w:szCs w:val="24"/>
+        </w:rPr>
+      </w:pPr>
+    </w:p>
+    <w:p>
+      <w:pPr>
+        <w:spacing w:after="0" w:line="240" w:lineRule="auto"/>
+        <w:rPr>
+          <w:rFonts w:ascii="Times New Roman" w:eastAsia="Times New Roman" w:hAnsi="Times New Roman" w:cs="Times New Roman"/>
+          <w:sz w:val="24"/>
+          <w:szCs w:val="24"/>
+        </w:rPr>
+      </w:pPr>
+      <w:r>
+        <w:rPr>
+          <w:rFonts w:ascii="Times New Roman" w:eastAsia="Times New Roman" w:hAnsi="Times New Roman" w:cs="Times New Roman"/>
+          <w:sz w:val="24"/>
+          <w:szCs w:val="24"/>
+        </w:rPr>
+        <w:br/>
+      </w:r>
+    </w:p>
+    <w:p>
+      <w:pPr>
+        <w:spacing w:before="100" w:beforeAutospacing="1" w:after="100" w:afterAutospacing="1" w:line="240" w:lineRule="auto"/>
+        <w:outlineLvl w:val="2"/>
         <w:rPr>
           <w:rFonts w:ascii="Times New Roman" w:eastAsia="Times New Roman" w:hAnsi="Times New Roman" w:cs="Times New Roman"/>
           <w:b/>
@@ -6250,711 +5229,9 @@
           <w:sz w:val="27"/>
           <w:szCs w:val="27"/>
         </w:rPr>
-        <w:t>R2. Baseline versus Proposed Performance — Main Results</w:t>
-      </w:r>
-    </w:p>
-    <w:p>
-      <w:pPr>
-        <w:spacing w:after="0" w:line="240" w:lineRule="auto"/>
-        <w:rPr>
-          <w:rFonts w:ascii="Times New Roman" w:eastAsia="Times New Roman" w:hAnsi="Times New Roman" w:cs="Times New Roman"/>
-          <w:sz w:val="24"/>
-          <w:szCs w:val="24"/>
-        </w:rPr>
-      </w:pPr>
-      <w:r>
-        <w:t>No held-out model performance can be calculated from the selected Excel workbook. Draft 0 values for $R^2$, MAE, RMSE, confidence intervals, and model differences are withdrawn because the workbook contains no respondent-level observations or saved predictions.</w:t>
-      </w:r>
-    </w:p>
-    <w:p>
-      <w:pPr>
-        <w:spacing w:after="0" w:line="240" w:lineRule="auto"/>
-        <w:rPr>
-          <w:rFonts w:ascii="Times New Roman" w:eastAsia="Times New Roman" w:hAnsi="Times New Roman" w:cs="Times New Roman"/>
-          <w:sz w:val="24"/>
-          <w:szCs w:val="24"/>
-        </w:rPr>
-      </w:pPr>
-    </w:p>
-    <w:p>
-      <w:pPr>
-        <w:spacing w:after="0" w:line="240" w:lineRule="auto"/>
-        <w:rPr>
-          <w:rFonts w:ascii="Times New Roman" w:eastAsia="Times New Roman" w:hAnsi="Times New Roman" w:cs="Times New Roman"/>
-          <w:sz w:val="24"/>
-          <w:szCs w:val="24"/>
-        </w:rPr>
-      </w:pPr>
-      <w:r>
-        <w:t>Table 3. Requested Model Performance Matrix (not estimable from aggregate frequency counts)</w:t>
-      </w:r>
-    </w:p>
-    <w:tbl>
-      <w:tblPr>
-        <w:tblW w:w="0" w:type="auto"/>
-        <w:tblCellSpacing w:w="15" w:type="dxa"/>
-        <w:tblCellMar>
-          <w:top w:w="15" w:type="dxa"/>
-          <w:left w:w="15" w:type="dxa"/>
-          <w:bottom w:w="15" w:type="dxa"/>
-          <w:right w:w="15" w:type="dxa"/>
-        </w:tblCellMar>
-        <w:tblLook w:val="04A0" w:firstRow="1" w:lastRow="0" w:firstColumn="1" w:lastColumn="0" w:noHBand="0" w:noVBand="1"/>
-      </w:tblPr>
-      <w:tblGrid>
-        <w:gridCol w:w="2238"/>
-        <w:gridCol w:w="1787"/>
-        <w:gridCol w:w="1741"/>
-        <w:gridCol w:w="1866"/>
-        <w:gridCol w:w="1712"/>
-      </w:tblGrid>
-      <w:tr>
-        <w:trPr>
-          <w:tblHeader/>
-          <w:tblCellSpacing w:w="15" w:type="dxa"/>
-        </w:trPr>
-        <w:tc>
-          <w:tcPr>
-            <w:tcW w:w="0" w:type="auto"/>
-            <w:tcBorders>
-              <w:top w:val="single" w:sz="6" w:space="0" w:color="C4C7C5"/>
-              <w:left w:val="single" w:sz="6" w:space="0" w:color="C4C7C5"/>
-              <w:bottom w:val="single" w:sz="6" w:space="0" w:color="C4C7C5"/>
-              <w:right w:val="single" w:sz="6" w:space="0" w:color="C4C7C5"/>
-            </w:tcBorders>
-            <w:tcMar>
-              <w:top w:w="120" w:type="dxa"/>
-              <w:left w:w="180" w:type="dxa"/>
-              <w:bottom w:w="120" w:type="dxa"/>
-              <w:right w:w="180" w:type="dxa"/>
-            </w:tcMar>
-            <w:vAlign w:val="center"/>
-            <w:hideMark/>
-          </w:tcPr>
-          <w:p>
-            <w:r>
-              <w:t>Model Architecture</w:t>
-            </w:r>
-          </w:p>
-        </w:tc>
-        <w:tc>
-          <w:tcPr>
-            <w:tcW w:w="0" w:type="auto"/>
-            <w:tcBorders>
-              <w:top w:val="single" w:sz="6" w:space="0" w:color="C4C7C5"/>
-              <w:left w:val="single" w:sz="6" w:space="0" w:color="C4C7C5"/>
-              <w:bottom w:val="single" w:sz="6" w:space="0" w:color="C4C7C5"/>
-              <w:right w:val="single" w:sz="6" w:space="0" w:color="C4C7C5"/>
-            </w:tcBorders>
-            <w:tcMar>
-              <w:top w:w="120" w:type="dxa"/>
-              <w:left w:w="180" w:type="dxa"/>
-              <w:bottom w:w="120" w:type="dxa"/>
-              <w:right w:w="180" w:type="dxa"/>
-            </w:tcMar>
-            <w:vAlign w:val="center"/>
-            <w:hideMark/>
-          </w:tcPr>
-          <w:p>
-            <w:r>
-              <w:t>R² Score (Primary)</w:t>
-            </w:r>
-          </w:p>
-        </w:tc>
-        <w:tc>
-          <w:tcPr>
-            <w:tcW w:w="0" w:type="auto"/>
-            <w:tcBorders>
-              <w:top w:val="single" w:sz="6" w:space="0" w:color="C4C7C5"/>
-              <w:left w:val="single" w:sz="6" w:space="0" w:color="C4C7C5"/>
-              <w:bottom w:val="single" w:sz="6" w:space="0" w:color="C4C7C5"/>
-              <w:right w:val="single" w:sz="6" w:space="0" w:color="C4C7C5"/>
-            </w:tcBorders>
-            <w:tcMar>
-              <w:top w:w="120" w:type="dxa"/>
-              <w:left w:w="180" w:type="dxa"/>
-              <w:bottom w:w="120" w:type="dxa"/>
-              <w:right w:w="180" w:type="dxa"/>
-            </w:tcMar>
-            <w:vAlign w:val="center"/>
-            <w:hideMark/>
-          </w:tcPr>
-          <w:p>
-            <w:r>
-              <w:t>MAE</w:t>
-            </w:r>
-          </w:p>
-        </w:tc>
-        <w:tc>
-          <w:tcPr>
-            <w:tcW w:w="0" w:type="auto"/>
-            <w:tcBorders>
-              <w:top w:val="single" w:sz="6" w:space="0" w:color="C4C7C5"/>
-              <w:left w:val="single" w:sz="6" w:space="0" w:color="C4C7C5"/>
-              <w:bottom w:val="single" w:sz="6" w:space="0" w:color="C4C7C5"/>
-              <w:right w:val="single" w:sz="6" w:space="0" w:color="C4C7C5"/>
-            </w:tcBorders>
-            <w:tcMar>
-              <w:top w:w="120" w:type="dxa"/>
-              <w:left w:w="180" w:type="dxa"/>
-              <w:bottom w:w="120" w:type="dxa"/>
-              <w:right w:w="180" w:type="dxa"/>
-            </w:tcMar>
-            <w:vAlign w:val="center"/>
-            <w:hideMark/>
-          </w:tcPr>
-          <w:p>
-            <w:r>
-              <w:t>RMSE (Primary)</w:t>
-            </w:r>
-          </w:p>
-        </w:tc>
-        <w:tc>
-          <w:tcPr>
-            <w:tcW w:w="0" w:type="auto"/>
-            <w:tcBorders>
-              <w:top w:val="single" w:sz="6" w:space="0" w:color="C4C7C5"/>
-              <w:left w:val="single" w:sz="6" w:space="0" w:color="C4C7C5"/>
-              <w:bottom w:val="single" w:sz="6" w:space="0" w:color="C4C7C5"/>
-              <w:right w:val="single" w:sz="6" w:space="0" w:color="C4C7C5"/>
-            </w:tcBorders>
-            <w:tcMar>
-              <w:top w:w="120" w:type="dxa"/>
-              <w:left w:w="180" w:type="dxa"/>
-              <w:bottom w:w="120" w:type="dxa"/>
-              <w:right w:w="180" w:type="dxa"/>
-            </w:tcMar>
-            <w:vAlign w:val="center"/>
-            <w:hideMark/>
-          </w:tcPr>
-          <w:p>
-            <w:r>
-              <w:t>Absolute Delta (R²)</w:t>
-            </w:r>
-          </w:p>
-        </w:tc>
-      </w:tr>
-      <w:tr>
-        <w:trPr>
-          <w:tblCellSpacing w:w="15" w:type="dxa"/>
-        </w:trPr>
-        <w:tc>
-          <w:tcPr>
-            <w:tcW w:w="0" w:type="auto"/>
-            <w:tcBorders>
-              <w:top w:val="single" w:sz="6" w:space="0" w:color="C4C7C5"/>
-              <w:left w:val="single" w:sz="6" w:space="0" w:color="C4C7C5"/>
-              <w:bottom w:val="single" w:sz="6" w:space="0" w:color="C4C7C5"/>
-              <w:right w:val="single" w:sz="6" w:space="0" w:color="C4C7C5"/>
-            </w:tcBorders>
-            <w:tcMar>
-              <w:top w:w="120" w:type="dxa"/>
-              <w:left w:w="180" w:type="dxa"/>
-              <w:bottom w:w="120" w:type="dxa"/>
-              <w:right w:w="180" w:type="dxa"/>
-            </w:tcMar>
-            <w:vAlign w:val="center"/>
-            <w:hideMark/>
-          </w:tcPr>
-          <w:p>
-            <w:r>
-              <w:t>OLS_raw</w:t>
-            </w:r>
-          </w:p>
-        </w:tc>
-        <w:tc>
-          <w:tcPr>
-            <w:tcW w:w="0" w:type="auto"/>
-            <w:tcBorders>
-              <w:top w:val="single" w:sz="6" w:space="0" w:color="C4C7C5"/>
-              <w:left w:val="single" w:sz="6" w:space="0" w:color="C4C7C5"/>
-              <w:bottom w:val="single" w:sz="6" w:space="0" w:color="C4C7C5"/>
-              <w:right w:val="single" w:sz="6" w:space="0" w:color="C4C7C5"/>
-            </w:tcBorders>
-            <w:tcMar>
-              <w:top w:w="120" w:type="dxa"/>
-              <w:left w:w="180" w:type="dxa"/>
-              <w:bottom w:w="120" w:type="dxa"/>
-              <w:right w:w="180" w:type="dxa"/>
-            </w:tcMar>
-            <w:vAlign w:val="center"/>
-            <w:hideMark/>
-          </w:tcPr>
-          <w:p>
-            <w:r>
-              <w:t>Not estimable from aggregate Excel counts</w:t>
-            </w:r>
-          </w:p>
-        </w:tc>
-        <w:tc>
-          <w:tcPr>
-            <w:tcW w:w="0" w:type="auto"/>
-            <w:tcBorders>
-              <w:top w:val="single" w:sz="6" w:space="0" w:color="C4C7C5"/>
-              <w:left w:val="single" w:sz="6" w:space="0" w:color="C4C7C5"/>
-              <w:bottom w:val="single" w:sz="6" w:space="0" w:color="C4C7C5"/>
-              <w:right w:val="single" w:sz="6" w:space="0" w:color="C4C7C5"/>
-            </w:tcBorders>
-            <w:tcMar>
-              <w:top w:w="120" w:type="dxa"/>
-              <w:left w:w="180" w:type="dxa"/>
-              <w:bottom w:w="120" w:type="dxa"/>
-              <w:right w:w="180" w:type="dxa"/>
-            </w:tcMar>
-            <w:vAlign w:val="center"/>
-            <w:hideMark/>
-          </w:tcPr>
-          <w:p>
-            <w:r>
-              <w:t>Not estimable from aggregate Excel counts</w:t>
-            </w:r>
-          </w:p>
-        </w:tc>
-        <w:tc>
-          <w:tcPr>
-            <w:tcW w:w="0" w:type="auto"/>
-            <w:tcBorders>
-              <w:top w:val="single" w:sz="6" w:space="0" w:color="C4C7C5"/>
-              <w:left w:val="single" w:sz="6" w:space="0" w:color="C4C7C5"/>
-              <w:bottom w:val="single" w:sz="6" w:space="0" w:color="C4C7C5"/>
-              <w:right w:val="single" w:sz="6" w:space="0" w:color="C4C7C5"/>
-            </w:tcBorders>
-            <w:tcMar>
-              <w:top w:w="120" w:type="dxa"/>
-              <w:left w:w="180" w:type="dxa"/>
-              <w:bottom w:w="120" w:type="dxa"/>
-              <w:right w:w="180" w:type="dxa"/>
-            </w:tcMar>
-            <w:vAlign w:val="center"/>
-            <w:hideMark/>
-          </w:tcPr>
-          <w:p>
-            <w:r>
-              <w:t>Not estimable from aggregate Excel counts</w:t>
-            </w:r>
-          </w:p>
-        </w:tc>
-        <w:tc>
-          <w:tcPr>
-            <w:tcW w:w="0" w:type="auto"/>
-            <w:tcBorders>
-              <w:top w:val="single" w:sz="6" w:space="0" w:color="C4C7C5"/>
-              <w:left w:val="single" w:sz="6" w:space="0" w:color="C4C7C5"/>
-              <w:bottom w:val="single" w:sz="6" w:space="0" w:color="C4C7C5"/>
-              <w:right w:val="single" w:sz="6" w:space="0" w:color="C4C7C5"/>
-            </w:tcBorders>
-            <w:tcMar>
-              <w:top w:w="120" w:type="dxa"/>
-              <w:left w:w="180" w:type="dxa"/>
-              <w:bottom w:w="120" w:type="dxa"/>
-              <w:right w:w="180" w:type="dxa"/>
-            </w:tcMar>
-            <w:vAlign w:val="center"/>
-            <w:hideMark/>
-          </w:tcPr>
-          <w:p>
-            <w:r>
-              <w:t>Not estimable from aggregate Excel counts</w:t>
-            </w:r>
-          </w:p>
-        </w:tc>
-      </w:tr>
-      <w:tr>
-        <w:trPr>
-          <w:tblCellSpacing w:w="15" w:type="dxa"/>
-        </w:trPr>
-        <w:tc>
-          <w:tcPr>
-            <w:tcW w:w="0" w:type="auto"/>
-            <w:tcBorders>
-              <w:top w:val="single" w:sz="6" w:space="0" w:color="C4C7C5"/>
-              <w:left w:val="single" w:sz="6" w:space="0" w:color="C4C7C5"/>
-              <w:bottom w:val="single" w:sz="6" w:space="0" w:color="C4C7C5"/>
-              <w:right w:val="single" w:sz="6" w:space="0" w:color="C4C7C5"/>
-            </w:tcBorders>
-            <w:tcMar>
-              <w:top w:w="120" w:type="dxa"/>
-              <w:left w:w="180" w:type="dxa"/>
-              <w:bottom w:w="120" w:type="dxa"/>
-              <w:right w:w="180" w:type="dxa"/>
-            </w:tcMar>
-            <w:vAlign w:val="center"/>
-            <w:hideMark/>
-          </w:tcPr>
-          <w:p>
-            <w:r>
-              <w:t>OLS_oof_te</w:t>
-            </w:r>
-          </w:p>
-        </w:tc>
-        <w:tc>
-          <w:tcPr>
-            <w:tcW w:w="0" w:type="auto"/>
-            <w:tcBorders>
-              <w:top w:val="single" w:sz="6" w:space="0" w:color="C4C7C5"/>
-              <w:left w:val="single" w:sz="6" w:space="0" w:color="C4C7C5"/>
-              <w:bottom w:val="single" w:sz="6" w:space="0" w:color="C4C7C5"/>
-              <w:right w:val="single" w:sz="6" w:space="0" w:color="C4C7C5"/>
-            </w:tcBorders>
-            <w:tcMar>
-              <w:top w:w="120" w:type="dxa"/>
-              <w:left w:w="180" w:type="dxa"/>
-              <w:bottom w:w="120" w:type="dxa"/>
-              <w:right w:w="180" w:type="dxa"/>
-            </w:tcMar>
-            <w:vAlign w:val="center"/>
-            <w:hideMark/>
-          </w:tcPr>
-          <w:p>
-            <w:r>
-              <w:t>Not estimable from aggregate Excel counts</w:t>
-            </w:r>
-          </w:p>
-        </w:tc>
-        <w:tc>
-          <w:tcPr>
-            <w:tcW w:w="0" w:type="auto"/>
-            <w:tcBorders>
-              <w:top w:val="single" w:sz="6" w:space="0" w:color="C4C7C5"/>
-              <w:left w:val="single" w:sz="6" w:space="0" w:color="C4C7C5"/>
-              <w:bottom w:val="single" w:sz="6" w:space="0" w:color="C4C7C5"/>
-              <w:right w:val="single" w:sz="6" w:space="0" w:color="C4C7C5"/>
-            </w:tcBorders>
-            <w:tcMar>
-              <w:top w:w="120" w:type="dxa"/>
-              <w:left w:w="180" w:type="dxa"/>
-              <w:bottom w:w="120" w:type="dxa"/>
-              <w:right w:w="180" w:type="dxa"/>
-            </w:tcMar>
-            <w:vAlign w:val="center"/>
-            <w:hideMark/>
-          </w:tcPr>
-          <w:p>
-            <w:r>
-              <w:t>Not estimable from aggregate Excel counts</w:t>
-            </w:r>
-          </w:p>
-        </w:tc>
-        <w:tc>
-          <w:tcPr>
-            <w:tcW w:w="0" w:type="auto"/>
-            <w:tcBorders>
-              <w:top w:val="single" w:sz="6" w:space="0" w:color="C4C7C5"/>
-              <w:left w:val="single" w:sz="6" w:space="0" w:color="C4C7C5"/>
-              <w:bottom w:val="single" w:sz="6" w:space="0" w:color="C4C7C5"/>
-              <w:right w:val="single" w:sz="6" w:space="0" w:color="C4C7C5"/>
-            </w:tcBorders>
-            <w:tcMar>
-              <w:top w:w="120" w:type="dxa"/>
-              <w:left w:w="180" w:type="dxa"/>
-              <w:bottom w:w="120" w:type="dxa"/>
-              <w:right w:w="180" w:type="dxa"/>
-            </w:tcMar>
-            <w:vAlign w:val="center"/>
-            <w:hideMark/>
-          </w:tcPr>
-          <w:p>
-            <w:r>
-              <w:t>Not estimable from aggregate Excel counts</w:t>
-            </w:r>
-          </w:p>
-        </w:tc>
-        <w:tc>
-          <w:tcPr>
-            <w:tcW w:w="0" w:type="auto"/>
-            <w:tcBorders>
-              <w:top w:val="single" w:sz="6" w:space="0" w:color="C4C7C5"/>
-              <w:left w:val="single" w:sz="6" w:space="0" w:color="C4C7C5"/>
-              <w:bottom w:val="single" w:sz="6" w:space="0" w:color="C4C7C5"/>
-              <w:right w:val="single" w:sz="6" w:space="0" w:color="C4C7C5"/>
-            </w:tcBorders>
-            <w:tcMar>
-              <w:top w:w="120" w:type="dxa"/>
-              <w:left w:w="180" w:type="dxa"/>
-              <w:bottom w:w="120" w:type="dxa"/>
-              <w:right w:w="180" w:type="dxa"/>
-            </w:tcMar>
-            <w:vAlign w:val="center"/>
-            <w:hideMark/>
-          </w:tcPr>
-          <w:p>
-            <w:r>
-              <w:t>Not estimable from aggregate Excel counts</w:t>
-            </w:r>
-          </w:p>
-        </w:tc>
-      </w:tr>
-      <w:tr>
-        <w:tc>
-          <w:tcPr>
-            <w:tcW w:type="dxa" w:w="2238"/>
-          </w:tcPr>
-          <w:p>
-            <w:r>
-              <w:t>LASSO_raw</w:t>
-            </w:r>
-          </w:p>
-        </w:tc>
-        <w:tc>
-          <w:tcPr>
-            <w:tcW w:type="dxa" w:w="1787"/>
-          </w:tcPr>
-          <w:p>
-            <w:r>
-              <w:t>Not estimable from aggregate Excel counts</w:t>
-            </w:r>
-          </w:p>
-        </w:tc>
-        <w:tc>
-          <w:tcPr>
-            <w:tcW w:type="dxa" w:w="1741"/>
-          </w:tcPr>
-          <w:p>
-            <w:r>
-              <w:t>Not estimable from aggregate Excel counts</w:t>
-            </w:r>
-          </w:p>
-        </w:tc>
-        <w:tc>
-          <w:tcPr>
-            <w:tcW w:type="dxa" w:w="1866"/>
-          </w:tcPr>
-          <w:p>
-            <w:r>
-              <w:t>Not estimable from aggregate Excel counts</w:t>
-            </w:r>
-          </w:p>
-        </w:tc>
-        <w:tc>
-          <w:tcPr>
-            <w:tcW w:type="dxa" w:w="1712"/>
-          </w:tcPr>
-          <w:p>
-            <w:r>
-              <w:t>Not estimable from aggregate Excel counts</w:t>
-            </w:r>
-          </w:p>
-        </w:tc>
-      </w:tr>
-      <w:tr>
-        <w:tc>
-          <w:tcPr>
-            <w:tcW w:type="dxa" w:w="2238"/>
-          </w:tcPr>
-          <w:p>
-            <w:r>
-              <w:t>LASSO_oof_te</w:t>
-            </w:r>
-          </w:p>
-        </w:tc>
-        <w:tc>
-          <w:tcPr>
-            <w:tcW w:type="dxa" w:w="1787"/>
-          </w:tcPr>
-          <w:p>
-            <w:r>
-              <w:t>Not estimable from aggregate Excel counts</w:t>
-            </w:r>
-          </w:p>
-        </w:tc>
-        <w:tc>
-          <w:tcPr>
-            <w:tcW w:type="dxa" w:w="1741"/>
-          </w:tcPr>
-          <w:p>
-            <w:r>
-              <w:t>Not estimable from aggregate Excel counts</w:t>
-            </w:r>
-          </w:p>
-        </w:tc>
-        <w:tc>
-          <w:tcPr>
-            <w:tcW w:type="dxa" w:w="1866"/>
-          </w:tcPr>
-          <w:p>
-            <w:r>
-              <w:t>Not estimable from aggregate Excel counts</w:t>
-            </w:r>
-          </w:p>
-        </w:tc>
-        <w:tc>
-          <w:tcPr>
-            <w:tcW w:type="dxa" w:w="1712"/>
-          </w:tcPr>
-          <w:p>
-            <w:r>
-              <w:t>Not estimable from aggregate Excel counts</w:t>
-            </w:r>
-          </w:p>
-        </w:tc>
-      </w:tr>
-      <w:tr>
-        <w:tc>
-          <w:tcPr>
-            <w:tcW w:type="dxa" w:w="2238"/>
-          </w:tcPr>
-          <w:p>
-            <w:r>
-              <w:t>Ridge_raw</w:t>
-            </w:r>
-          </w:p>
-        </w:tc>
-        <w:tc>
-          <w:tcPr>
-            <w:tcW w:type="dxa" w:w="1787"/>
-          </w:tcPr>
-          <w:p>
-            <w:r>
-              <w:t>Not estimable from aggregate Excel counts</w:t>
-            </w:r>
-          </w:p>
-        </w:tc>
-        <w:tc>
-          <w:tcPr>
-            <w:tcW w:type="dxa" w:w="1741"/>
-          </w:tcPr>
-          <w:p>
-            <w:r>
-              <w:t>Not estimable from aggregate Excel counts</w:t>
-            </w:r>
-          </w:p>
-        </w:tc>
-        <w:tc>
-          <w:tcPr>
-            <w:tcW w:type="dxa" w:w="1866"/>
-          </w:tcPr>
-          <w:p>
-            <w:r>
-              <w:t>Not estimable from aggregate Excel counts</w:t>
-            </w:r>
-          </w:p>
-        </w:tc>
-        <w:tc>
-          <w:tcPr>
-            <w:tcW w:type="dxa" w:w="1712"/>
-          </w:tcPr>
-          <w:p>
-            <w:r>
-              <w:t>Not estimable from aggregate Excel counts</w:t>
-            </w:r>
-          </w:p>
-        </w:tc>
-      </w:tr>
-      <w:tr>
-        <w:tc>
-          <w:tcPr>
-            <w:tcW w:type="dxa" w:w="2238"/>
-          </w:tcPr>
-          <w:p>
-            <w:r>
-              <w:t>Ridge_oof_te</w:t>
-            </w:r>
-          </w:p>
-        </w:tc>
-        <w:tc>
-          <w:tcPr>
-            <w:tcW w:type="dxa" w:w="1787"/>
-          </w:tcPr>
-          <w:p>
-            <w:r>
-              <w:t>Not estimable from aggregate Excel counts</w:t>
-            </w:r>
-          </w:p>
-        </w:tc>
-        <w:tc>
-          <w:tcPr>
-            <w:tcW w:type="dxa" w:w="1741"/>
-          </w:tcPr>
-          <w:p>
-            <w:r>
-              <w:t>Not estimable from aggregate Excel counts</w:t>
-            </w:r>
-          </w:p>
-        </w:tc>
-        <w:tc>
-          <w:tcPr>
-            <w:tcW w:type="dxa" w:w="1866"/>
-          </w:tcPr>
-          <w:p>
-            <w:r>
-              <w:t>Not estimable from aggregate Excel counts</w:t>
-            </w:r>
-          </w:p>
-        </w:tc>
-        <w:tc>
-          <w:tcPr>
-            <w:tcW w:type="dxa" w:w="1712"/>
-          </w:tcPr>
-          <w:p>
-            <w:r>
-              <w:t>Not estimable from aggregate Excel counts</w:t>
-            </w:r>
-          </w:p>
-        </w:tc>
-      </w:tr>
-    </w:tbl>
-    <w:p>
-      <w:pPr>
-        <w:spacing w:after="0" w:line="240" w:lineRule="auto"/>
-        <w:rPr>
-          <w:rFonts w:ascii="Times New Roman" w:eastAsia="Times New Roman" w:hAnsi="Times New Roman" w:cs="Times New Roman"/>
-          <w:sz w:val="24"/>
-          <w:szCs w:val="24"/>
-        </w:rPr>
-      </w:pPr>
-    </w:p>
-    <w:p>
-      <w:pPr>
-        <w:spacing w:after="0" w:line="240" w:lineRule="auto"/>
-        <w:rPr>
-          <w:rFonts w:ascii="Times New Roman" w:eastAsia="Times New Roman" w:hAnsi="Times New Roman" w:cs="Times New Roman"/>
-          <w:sz w:val="24"/>
-          <w:szCs w:val="24"/>
-        </w:rPr>
-      </w:pPr>
-      <w:r>
-        <w:t>All six arms are unfit on the selected workbook. The table records this limitation rather than substituting derived or synthetic model results.</w:t>
-      </w:r>
-    </w:p>
-    <w:p>
-      <w:pPr>
-        <w:spacing w:after="0" w:line="240" w:lineRule="auto"/>
-        <w:rPr>
-          <w:rFonts w:ascii="Times New Roman" w:eastAsia="Times New Roman" w:hAnsi="Times New Roman" w:cs="Times New Roman"/>
-          <w:sz w:val="24"/>
-          <w:szCs w:val="24"/>
-        </w:rPr>
-      </w:pPr>
-      <w:r>
-        <w:rPr>
-          <w:rFonts w:ascii="Times New Roman" w:eastAsia="Times New Roman" w:hAnsi="Times New Roman" w:cs="Times New Roman"/>
-          <w:sz w:val="24"/>
-          <w:szCs w:val="24"/>
-        </w:rPr>
-        <w:br/>
-      </w:r>
-    </w:p>
-    <w:p>
-      <w:pPr>
-        <w:spacing w:before="100" w:beforeAutospacing="1" w:after="100" w:afterAutospacing="1" w:line="240" w:lineRule="auto"/>
-        <w:outlineLvl w:val="2"/>
-        <w:rPr>
-          <w:rFonts w:ascii="Times New Roman" w:eastAsia="Times New Roman" w:hAnsi="Times New Roman" w:cs="Times New Roman"/>
-          <w:b/>
-          <w:bCs/>
-          <w:sz w:val="27"/>
-          <w:szCs w:val="27"/>
-        </w:rPr>
-      </w:pPr>
-      <w:r>
-        <w:rPr>
-          <w:rFonts w:ascii="Times New Roman" w:eastAsia="Times New Roman" w:hAnsi="Times New Roman" w:cs="Times New Roman"/>
-          <w:b/>
-          <w:bCs/>
-          <w:sz w:val="27"/>
-          <w:szCs w:val="27"/>
-        </w:rPr>
-        <w:t>R3. Stability and Variance Across Runs and Folds</w:t>
+      </w:pPr>
+      <w:r>
+        <w:t>R3. Model Stability: Not Assessed</w:t>
       </w:r>
     </w:p>
     <w:p>
@@ -7030,100 +5307,6 @@
         </w:rPr>
       </w:pPr>
       <w:r>
-        <w:rPr>
-          <w:noProof/>
-        </w:rPr>
-        <w:lastRenderedPageBreak/>
-        <w:drawing>
-          <wp:anchor distT="0" distB="0" distL="114300" distR="114300" simplePos="0" relativeHeight="251665408" behindDoc="0" locked="0" layoutInCell="1" allowOverlap="1" wp14:anchorId="01BEDD4B" wp14:editId="7C336495">
-            <wp:simplePos x="0" y="0"/>
-            <wp:positionH relativeFrom="column">
-              <wp:posOffset>7620</wp:posOffset>
-            </wp:positionH>
-            <wp:positionV relativeFrom="paragraph">
-              <wp:posOffset>175260</wp:posOffset>
-            </wp:positionV>
-            <wp:extent cx="6332402" cy="2631917"/>
-            <wp:effectExtent l="0" t="0" r="0" b="0"/>
-            <wp:wrapSquare wrapText="bothSides"/>
-            <wp:docPr id="4" name="Image4"/>
-            <wp:cNvGraphicFramePr/>
-            <a:graphic xmlns:a="http://schemas.openxmlformats.org/drawingml/2006/main">
-              <a:graphicData uri="http://schemas.openxmlformats.org/drawingml/2006/picture">
-                <pic:pic xmlns:pic="http://schemas.openxmlformats.org/drawingml/2006/picture">
-                  <pic:nvPicPr>
-                    <pic:cNvPr id="0" name=""/>
-                    <pic:cNvPicPr/>
-                  </pic:nvPicPr>
-                  <pic:blipFill>
-                    <a:blip r:embed="rId8">
-                      <a:lum/>
-                      <a:alphaModFix/>
-                    </a:blip>
-                    <a:srcRect/>
-                    <a:stretch>
-                      <a:fillRect/>
-                    </a:stretch>
-                  </pic:blipFill>
-                  <pic:spPr>
-                    <a:xfrm>
-                      <a:off x="0" y="0"/>
-                      <a:ext cx="6332402" cy="2631917"/>
-                    </a:xfrm>
-                    <a:prstGeom prst="rect">
-                      <a:avLst/>
-                    </a:prstGeom>
-                  </pic:spPr>
-                </pic:pic>
-              </a:graphicData>
-            </a:graphic>
-          </wp:anchor>
-        </w:drawing>
-      </w:r>
-    </w:p>
-    <w:p>
-      <w:pPr>
-        <w:spacing w:after="0" w:line="240" w:lineRule="auto"/>
-        <w:rPr>
-          <w:rFonts w:ascii="Times New Roman" w:eastAsia="Times New Roman" w:hAnsi="Times New Roman" w:cs="Times New Roman"/>
-          <w:sz w:val="24"/>
-          <w:szCs w:val="24"/>
-        </w:rPr>
-      </w:pPr>
-    </w:p>
-    <w:p>
-      <w:pPr>
-        <w:spacing w:after="0" w:line="240" w:lineRule="auto"/>
-        <w:rPr>
-          <w:rFonts w:ascii="Times New Roman" w:eastAsia="Times New Roman" w:hAnsi="Times New Roman" w:cs="Times New Roman"/>
-          <w:sz w:val="24"/>
-          <w:szCs w:val="24"/>
-        </w:rPr>
-      </w:pPr>
-      <w:r>
-        <w:t>Figure 4. Model performance panels are unavailable because the selected Excel workbook contains only aggregate counts.</w:t>
-      </w:r>
-    </w:p>
-    <w:p>
-      <w:pPr>
-        <w:spacing w:after="0" w:line="240" w:lineRule="auto"/>
-        <w:rPr>
-          <w:rFonts w:ascii="Times New Roman" w:eastAsia="Times New Roman" w:hAnsi="Times New Roman" w:cs="Times New Roman"/>
-          <w:sz w:val="24"/>
-          <w:szCs w:val="24"/>
-        </w:rPr>
-      </w:pPr>
-    </w:p>
-    <w:p>
-      <w:pPr>
-        <w:spacing w:after="0" w:line="240" w:lineRule="auto"/>
-        <w:rPr>
-          <w:rFonts w:ascii="Times New Roman" w:eastAsia="Times New Roman" w:hAnsi="Times New Roman" w:cs="Times New Roman"/>
-          <w:sz w:val="24"/>
-          <w:szCs w:val="24"/>
-        </w:rPr>
-      </w:pPr>
-      <w:r>
         <w:t>No model range or standard deviation is reported. These summaries require saved held-out predictions, which are not available from the workbook.</w:t>
       </w:r>
     </w:p>
@@ -7212,6 +5395,26 @@
         </w:rPr>
       </w:pPr>
       <w:r>
+        <w:t>R5. Ablation: Not Conducted</w:t>
+      </w:r>
+    </w:p>
+    <w:p>
+      <w:pPr>
+        <w:spacing w:after="0" w:line="240" w:lineRule="auto"/>
+        <w:rPr>
+          <w:rFonts w:ascii="Times New Roman" w:eastAsia="Times New Roman" w:hAnsi="Times New Roman" w:cs="Times New Roman"/>
+          <w:sz w:val="24"/>
+          <w:szCs w:val="24"/>
+        </w:rPr>
+      </w:pPr>
+      <w:r>
+        <w:t>No ablation was conducted. The proposed four-arm comparison remains conditional future work and requires respondent-level inputs.</w:t>
+      </w:r>
+    </w:p>
+    <w:p>
+      <w:pPr>
+        <w:spacing w:before="100" w:beforeAutospacing="1" w:after="100" w:afterAutospacing="1" w:line="240" w:lineRule="auto"/>
+        <w:outlineLvl w:val="2"/>
         <w:rPr>
           <w:rFonts w:ascii="Times New Roman" w:eastAsia="Times New Roman" w:hAnsi="Times New Roman" w:cs="Times New Roman"/>
           <w:b/>
@@ -7219,688 +5422,22 @@
           <w:sz w:val="27"/>
           <w:szCs w:val="27"/>
         </w:rPr>
-        <w:t>R5. Contribution Isolation — Ablation Analysis</w:t>
-      </w:r>
-    </w:p>
-    <w:p>
-      <w:pPr>
-        <w:spacing w:after="0" w:line="240" w:lineRule="auto"/>
-        <w:rPr>
-          <w:rFonts w:ascii="Times New Roman" w:eastAsia="Times New Roman" w:hAnsi="Times New Roman" w:cs="Times New Roman"/>
-          <w:sz w:val="24"/>
-          <w:szCs w:val="24"/>
-        </w:rPr>
-      </w:pPr>
-      <w:r>
-        <w:t>No component ablation has been run. The factorial design cannot be executed from the selected workbook because the required respondent-level inputs are absent.</w:t>
-      </w:r>
-    </w:p>
-    <w:p>
-      <w:pPr>
-        <w:spacing w:after="0" w:line="240" w:lineRule="auto"/>
-        <w:rPr>
-          <w:rFonts w:ascii="Times New Roman" w:eastAsia="Times New Roman" w:hAnsi="Times New Roman" w:cs="Times New Roman"/>
-          <w:sz w:val="24"/>
-          <w:szCs w:val="24"/>
-        </w:rPr>
-      </w:pPr>
-    </w:p>
-    <w:p>
-      <w:pPr>
-        <w:spacing w:after="0" w:line="240" w:lineRule="auto"/>
-        <w:rPr>
-          <w:rFonts w:ascii="Times New Roman" w:eastAsia="Times New Roman" w:hAnsi="Times New Roman" w:cs="Times New Roman"/>
-          <w:sz w:val="24"/>
-          <w:szCs w:val="24"/>
-        </w:rPr>
-      </w:pPr>
-      <w:r>
-        <w:t>Table 4. Planned Factorial Model Arms (not fitted; aggregate workbook is insufficient)</w:t>
-      </w:r>
-    </w:p>
-    <w:tbl>
-      <w:tblPr>
-        <w:tblW w:w="0" w:type="auto"/>
-        <w:tblCellSpacing w:w="15" w:type="dxa"/>
-        <w:tblCellMar>
-          <w:top w:w="15" w:type="dxa"/>
-          <w:left w:w="15" w:type="dxa"/>
-          <w:bottom w:w="15" w:type="dxa"/>
-          <w:right w:w="15" w:type="dxa"/>
-        </w:tblCellMar>
-        <w:tblLook w:val="04A0" w:firstRow="1" w:lastRow="0" w:firstColumn="1" w:lastColumn="0" w:noHBand="0" w:noVBand="1"/>
-      </w:tblPr>
-      <w:tblGrid>
-        <w:gridCol w:w="2567"/>
-        <w:gridCol w:w="1460"/>
-        <w:gridCol w:w="1580"/>
-        <w:gridCol w:w="1604"/>
-        <w:gridCol w:w="2133"/>
-      </w:tblGrid>
-      <w:tr>
-        <w:trPr>
-          <w:tblHeader/>
-          <w:tblCellSpacing w:w="15" w:type="dxa"/>
-        </w:trPr>
-        <w:tc>
-          <w:tcPr>
-            <w:tcW w:w="0" w:type="auto"/>
-            <w:tcBorders>
-              <w:top w:val="single" w:sz="6" w:space="0" w:color="C4C7C5"/>
-              <w:left w:val="single" w:sz="6" w:space="0" w:color="C4C7C5"/>
-              <w:bottom w:val="single" w:sz="6" w:space="0" w:color="C4C7C5"/>
-              <w:right w:val="single" w:sz="6" w:space="0" w:color="C4C7C5"/>
-            </w:tcBorders>
-            <w:tcMar>
-              <w:top w:w="120" w:type="dxa"/>
-              <w:left w:w="180" w:type="dxa"/>
-              <w:bottom w:w="120" w:type="dxa"/>
-              <w:right w:w="180" w:type="dxa"/>
-            </w:tcMar>
-            <w:vAlign w:val="center"/>
-            <w:hideMark/>
-          </w:tcPr>
-          <w:p>
-            <w:r>
-              <w:t>Model Architecture / Comparison Arm</w:t>
-            </w:r>
-          </w:p>
-        </w:tc>
-        <w:tc>
-          <w:tcPr>
-            <w:tcW w:w="0" w:type="auto"/>
-            <w:tcBorders>
-              <w:top w:val="single" w:sz="6" w:space="0" w:color="C4C7C5"/>
-              <w:left w:val="single" w:sz="6" w:space="0" w:color="C4C7C5"/>
-              <w:bottom w:val="single" w:sz="6" w:space="0" w:color="C4C7C5"/>
-              <w:right w:val="single" w:sz="6" w:space="0" w:color="C4C7C5"/>
-            </w:tcBorders>
-            <w:tcMar>
-              <w:top w:w="120" w:type="dxa"/>
-              <w:left w:w="180" w:type="dxa"/>
-              <w:bottom w:w="120" w:type="dxa"/>
-              <w:right w:w="180" w:type="dxa"/>
-            </w:tcMar>
-            <w:vAlign w:val="center"/>
-            <w:hideMark/>
-          </w:tcPr>
-          <w:p>
-            <w:r>
-              <w:t>R² Score</w:t>
-            </w:r>
-          </w:p>
-        </w:tc>
-        <w:tc>
-          <w:tcPr>
-            <w:tcW w:w="0" w:type="auto"/>
-            <w:tcBorders>
-              <w:top w:val="single" w:sz="6" w:space="0" w:color="C4C7C5"/>
-              <w:left w:val="single" w:sz="6" w:space="0" w:color="C4C7C5"/>
-              <w:bottom w:val="single" w:sz="6" w:space="0" w:color="C4C7C5"/>
-              <w:right w:val="single" w:sz="6" w:space="0" w:color="C4C7C5"/>
-            </w:tcBorders>
-            <w:tcMar>
-              <w:top w:w="120" w:type="dxa"/>
-              <w:left w:w="180" w:type="dxa"/>
-              <w:bottom w:w="120" w:type="dxa"/>
-              <w:right w:w="180" w:type="dxa"/>
-            </w:tcMar>
-            <w:vAlign w:val="center"/>
-            <w:hideMark/>
-          </w:tcPr>
-          <w:p>
-            <w:r>
-              <w:t>MAE</w:t>
-            </w:r>
-          </w:p>
-        </w:tc>
-        <w:tc>
-          <w:tcPr>
-            <w:tcW w:w="0" w:type="auto"/>
-            <w:tcBorders>
-              <w:top w:val="single" w:sz="6" w:space="0" w:color="C4C7C5"/>
-              <w:left w:val="single" w:sz="6" w:space="0" w:color="C4C7C5"/>
-              <w:bottom w:val="single" w:sz="6" w:space="0" w:color="C4C7C5"/>
-              <w:right w:val="single" w:sz="6" w:space="0" w:color="C4C7C5"/>
-            </w:tcBorders>
-            <w:tcMar>
-              <w:top w:w="120" w:type="dxa"/>
-              <w:left w:w="180" w:type="dxa"/>
-              <w:bottom w:w="120" w:type="dxa"/>
-              <w:right w:w="180" w:type="dxa"/>
-            </w:tcMar>
-            <w:vAlign w:val="center"/>
-            <w:hideMark/>
-          </w:tcPr>
-          <w:p>
-            <w:r>
-              <w:t>RMSE</w:t>
-            </w:r>
-          </w:p>
-        </w:tc>
-        <w:tc>
-          <w:tcPr>
-            <w:tcW w:w="0" w:type="auto"/>
-            <w:tcBorders>
-              <w:top w:val="single" w:sz="6" w:space="0" w:color="C4C7C5"/>
-              <w:left w:val="single" w:sz="6" w:space="0" w:color="C4C7C5"/>
-              <w:bottom w:val="single" w:sz="6" w:space="0" w:color="C4C7C5"/>
-              <w:right w:val="single" w:sz="6" w:space="0" w:color="C4C7C5"/>
-            </w:tcBorders>
-            <w:tcMar>
-              <w:top w:w="120" w:type="dxa"/>
-              <w:left w:w="180" w:type="dxa"/>
-              <w:bottom w:w="120" w:type="dxa"/>
-              <w:right w:w="180" w:type="dxa"/>
-            </w:tcMar>
-            <w:vAlign w:val="center"/>
-            <w:hideMark/>
-          </w:tcPr>
-          <w:p>
-            <w:r>
-              <w:t>Feature Space / Status</w:t>
-            </w:r>
-          </w:p>
-        </w:tc>
-      </w:tr>
-      <w:tr>
-        <w:trPr>
-          <w:tblCellSpacing w:w="15" w:type="dxa"/>
-        </w:trPr>
-        <w:tc>
-          <w:tcPr>
-            <w:tcW w:w="0" w:type="auto"/>
-            <w:tcBorders>
-              <w:top w:val="single" w:sz="6" w:space="0" w:color="C4C7C5"/>
-              <w:left w:val="single" w:sz="6" w:space="0" w:color="C4C7C5"/>
-              <w:bottom w:val="single" w:sz="6" w:space="0" w:color="C4C7C5"/>
-              <w:right w:val="single" w:sz="6" w:space="0" w:color="C4C7C5"/>
-            </w:tcBorders>
-            <w:tcMar>
-              <w:top w:w="120" w:type="dxa"/>
-              <w:left w:w="180" w:type="dxa"/>
-              <w:bottom w:w="120" w:type="dxa"/>
-              <w:right w:w="180" w:type="dxa"/>
-            </w:tcMar>
-            <w:vAlign w:val="center"/>
-            <w:hideMark/>
-          </w:tcPr>
-          <w:p>
-            <w:r>
-              <w:t>OLS_raw</w:t>
-            </w:r>
-          </w:p>
-        </w:tc>
-        <w:tc>
-          <w:tcPr>
-            <w:tcW w:w="0" w:type="auto"/>
-            <w:tcBorders>
-              <w:top w:val="single" w:sz="6" w:space="0" w:color="C4C7C5"/>
-              <w:left w:val="single" w:sz="6" w:space="0" w:color="C4C7C5"/>
-              <w:bottom w:val="single" w:sz="6" w:space="0" w:color="C4C7C5"/>
-              <w:right w:val="single" w:sz="6" w:space="0" w:color="C4C7C5"/>
-            </w:tcBorders>
-            <w:tcMar>
-              <w:top w:w="120" w:type="dxa"/>
-              <w:left w:w="180" w:type="dxa"/>
-              <w:bottom w:w="120" w:type="dxa"/>
-              <w:right w:w="180" w:type="dxa"/>
-            </w:tcMar>
-            <w:vAlign w:val="center"/>
-            <w:hideMark/>
-          </w:tcPr>
-          <w:p>
-            <w:r>
-              <w:t>Not fitted; no respondent-level rows</w:t>
-            </w:r>
-          </w:p>
-        </w:tc>
-        <w:tc>
-          <w:tcPr>
-            <w:tcW w:w="0" w:type="auto"/>
-            <w:tcBorders>
-              <w:top w:val="single" w:sz="6" w:space="0" w:color="C4C7C5"/>
-              <w:left w:val="single" w:sz="6" w:space="0" w:color="C4C7C5"/>
-              <w:bottom w:val="single" w:sz="6" w:space="0" w:color="C4C7C5"/>
-              <w:right w:val="single" w:sz="6" w:space="0" w:color="C4C7C5"/>
-            </w:tcBorders>
-            <w:tcMar>
-              <w:top w:w="120" w:type="dxa"/>
-              <w:left w:w="180" w:type="dxa"/>
-              <w:bottom w:w="120" w:type="dxa"/>
-              <w:right w:w="180" w:type="dxa"/>
-            </w:tcMar>
-            <w:vAlign w:val="center"/>
-            <w:hideMark/>
-          </w:tcPr>
-          <w:p>
-            <w:r>
-              <w:t>Not fitted; no respondent-level rows</w:t>
-            </w:r>
-          </w:p>
-        </w:tc>
-        <w:tc>
-          <w:tcPr>
-            <w:tcW w:w="0" w:type="auto"/>
-            <w:tcBorders>
-              <w:top w:val="single" w:sz="6" w:space="0" w:color="C4C7C5"/>
-              <w:left w:val="single" w:sz="6" w:space="0" w:color="C4C7C5"/>
-              <w:bottom w:val="single" w:sz="6" w:space="0" w:color="C4C7C5"/>
-              <w:right w:val="single" w:sz="6" w:space="0" w:color="C4C7C5"/>
-            </w:tcBorders>
-            <w:tcMar>
-              <w:top w:w="120" w:type="dxa"/>
-              <w:left w:w="180" w:type="dxa"/>
-              <w:bottom w:w="120" w:type="dxa"/>
-              <w:right w:w="180" w:type="dxa"/>
-            </w:tcMar>
-            <w:vAlign w:val="center"/>
-            <w:hideMark/>
-          </w:tcPr>
-          <w:p>
-            <w:r>
-              <w:t>Not fitted; no respondent-level rows</w:t>
-            </w:r>
-          </w:p>
-        </w:tc>
-        <w:tc>
-          <w:tcPr>
-            <w:tcW w:w="0" w:type="auto"/>
-            <w:tcBorders>
-              <w:top w:val="single" w:sz="6" w:space="0" w:color="C4C7C5"/>
-              <w:left w:val="single" w:sz="6" w:space="0" w:color="C4C7C5"/>
-              <w:bottom w:val="single" w:sz="6" w:space="0" w:color="C4C7C5"/>
-              <w:right w:val="single" w:sz="6" w:space="0" w:color="C4C7C5"/>
-            </w:tcBorders>
-            <w:tcMar>
-              <w:top w:w="120" w:type="dxa"/>
-              <w:left w:w="180" w:type="dxa"/>
-              <w:bottom w:w="120" w:type="dxa"/>
-              <w:right w:w="180" w:type="dxa"/>
-            </w:tcMar>
-            <w:vAlign w:val="center"/>
-            <w:hideMark/>
-          </w:tcPr>
-          <w:p>
-            <w:r>
-              <w:t>One-hot candidate fields; unavailable in row-level form</w:t>
-            </w:r>
-          </w:p>
-        </w:tc>
-      </w:tr>
-      <w:tr>
-        <w:trPr>
-          <w:tblCellSpacing w:w="15" w:type="dxa"/>
-        </w:trPr>
-        <w:tc>
-          <w:tcPr>
-            <w:tcW w:w="0" w:type="auto"/>
-            <w:tcBorders>
-              <w:top w:val="single" w:sz="6" w:space="0" w:color="C4C7C5"/>
-              <w:left w:val="single" w:sz="6" w:space="0" w:color="C4C7C5"/>
-              <w:bottom w:val="single" w:sz="6" w:space="0" w:color="C4C7C5"/>
-              <w:right w:val="single" w:sz="6" w:space="0" w:color="C4C7C5"/>
-            </w:tcBorders>
-            <w:tcMar>
-              <w:top w:w="120" w:type="dxa"/>
-              <w:left w:w="180" w:type="dxa"/>
-              <w:bottom w:w="120" w:type="dxa"/>
-              <w:right w:w="180" w:type="dxa"/>
-            </w:tcMar>
-            <w:vAlign w:val="center"/>
-            <w:hideMark/>
-          </w:tcPr>
-          <w:p>
-            <w:r>
-              <w:t>OLS_oof_te</w:t>
-            </w:r>
-          </w:p>
-        </w:tc>
-        <w:tc>
-          <w:tcPr>
-            <w:tcW w:w="0" w:type="auto"/>
-            <w:tcBorders>
-              <w:top w:val="single" w:sz="6" w:space="0" w:color="C4C7C5"/>
-              <w:left w:val="single" w:sz="6" w:space="0" w:color="C4C7C5"/>
-              <w:bottom w:val="single" w:sz="6" w:space="0" w:color="C4C7C5"/>
-              <w:right w:val="single" w:sz="6" w:space="0" w:color="C4C7C5"/>
-            </w:tcBorders>
-            <w:tcMar>
-              <w:top w:w="120" w:type="dxa"/>
-              <w:left w:w="180" w:type="dxa"/>
-              <w:bottom w:w="120" w:type="dxa"/>
-              <w:right w:w="180" w:type="dxa"/>
-            </w:tcMar>
-            <w:vAlign w:val="center"/>
-            <w:hideMark/>
-          </w:tcPr>
-          <w:p>
-            <w:r>
-              <w:t>Not fitted; no respondent-level rows</w:t>
-            </w:r>
-          </w:p>
-        </w:tc>
-        <w:tc>
-          <w:tcPr>
-            <w:tcW w:w="0" w:type="auto"/>
-            <w:tcBorders>
-              <w:top w:val="single" w:sz="6" w:space="0" w:color="C4C7C5"/>
-              <w:left w:val="single" w:sz="6" w:space="0" w:color="C4C7C5"/>
-              <w:bottom w:val="single" w:sz="6" w:space="0" w:color="C4C7C5"/>
-              <w:right w:val="single" w:sz="6" w:space="0" w:color="C4C7C5"/>
-            </w:tcBorders>
-            <w:tcMar>
-              <w:top w:w="120" w:type="dxa"/>
-              <w:left w:w="180" w:type="dxa"/>
-              <w:bottom w:w="120" w:type="dxa"/>
-              <w:right w:w="180" w:type="dxa"/>
-            </w:tcMar>
-            <w:vAlign w:val="center"/>
-            <w:hideMark/>
-          </w:tcPr>
-          <w:p>
-            <w:r>
-              <w:t>Not fitted; no respondent-level rows</w:t>
-            </w:r>
-          </w:p>
-        </w:tc>
-        <w:tc>
-          <w:tcPr>
-            <w:tcW w:w="0" w:type="auto"/>
-            <w:tcBorders>
-              <w:top w:val="single" w:sz="6" w:space="0" w:color="C4C7C5"/>
-              <w:left w:val="single" w:sz="6" w:space="0" w:color="C4C7C5"/>
-              <w:bottom w:val="single" w:sz="6" w:space="0" w:color="C4C7C5"/>
-              <w:right w:val="single" w:sz="6" w:space="0" w:color="C4C7C5"/>
-            </w:tcBorders>
-            <w:tcMar>
-              <w:top w:w="120" w:type="dxa"/>
-              <w:left w:w="180" w:type="dxa"/>
-              <w:bottom w:w="120" w:type="dxa"/>
-              <w:right w:w="180" w:type="dxa"/>
-            </w:tcMar>
-            <w:vAlign w:val="center"/>
-            <w:hideMark/>
-          </w:tcPr>
-          <w:p>
-            <w:r>
-              <w:t>Not fitted; no respondent-level rows</w:t>
-            </w:r>
-          </w:p>
-        </w:tc>
-        <w:tc>
-          <w:tcPr>
-            <w:tcW w:w="0" w:type="auto"/>
-            <w:tcBorders>
-              <w:top w:val="single" w:sz="6" w:space="0" w:color="C4C7C5"/>
-              <w:left w:val="single" w:sz="6" w:space="0" w:color="C4C7C5"/>
-              <w:bottom w:val="single" w:sz="6" w:space="0" w:color="C4C7C5"/>
-              <w:right w:val="single" w:sz="6" w:space="0" w:color="C4C7C5"/>
-            </w:tcBorders>
-            <w:tcMar>
-              <w:top w:w="120" w:type="dxa"/>
-              <w:left w:w="180" w:type="dxa"/>
-              <w:bottom w:w="120" w:type="dxa"/>
-              <w:right w:w="180" w:type="dxa"/>
-            </w:tcMar>
-            <w:vAlign w:val="center"/>
-            <w:hideMark/>
-          </w:tcPr>
-          <w:p>
-            <w:r>
-              <w:t>Not available; no respondent-level row encoding</w:t>
-            </w:r>
-          </w:p>
-        </w:tc>
-      </w:tr>
-      <w:tr>
-        <w:tc>
-          <w:tcPr>
-            <w:tcW w:type="dxa" w:w="2567"/>
-          </w:tcPr>
-          <w:p>
-            <w:r>
-              <w:t>LASSO_raw</w:t>
-            </w:r>
-          </w:p>
-        </w:tc>
-        <w:tc>
-          <w:tcPr>
-            <w:tcW w:type="dxa" w:w="1460"/>
-          </w:tcPr>
-          <w:p>
-            <w:r>
-              <w:t>Not fitted; no respondent-level rows</w:t>
-            </w:r>
-          </w:p>
-        </w:tc>
-        <w:tc>
-          <w:tcPr>
-            <w:tcW w:type="dxa" w:w="1580"/>
-          </w:tcPr>
-          <w:p>
-            <w:r>
-              <w:t>Not fitted; no respondent-level rows</w:t>
-            </w:r>
-          </w:p>
-        </w:tc>
-        <w:tc>
-          <w:tcPr>
-            <w:tcW w:type="dxa" w:w="1604"/>
-          </w:tcPr>
-          <w:p>
-            <w:r>
-              <w:t>Not fitted; no respondent-level rows</w:t>
-            </w:r>
-          </w:p>
-        </w:tc>
-        <w:tc>
-          <w:tcPr>
-            <w:tcW w:type="dxa" w:w="2133"/>
-          </w:tcPr>
-          <w:p>
-            <w:r>
-              <w:t>Not fitted; outcome rows unavailable</w:t>
-            </w:r>
-          </w:p>
-        </w:tc>
-      </w:tr>
-      <w:tr>
-        <w:tc>
-          <w:tcPr>
-            <w:tcW w:type="dxa" w:w="2567"/>
-          </w:tcPr>
-          <w:p>
-            <w:r>
-              <w:t>LASSO_oof_te</w:t>
-            </w:r>
-          </w:p>
-        </w:tc>
-        <w:tc>
-          <w:tcPr>
-            <w:tcW w:type="dxa" w:w="1460"/>
-          </w:tcPr>
-          <w:p>
-            <w:r>
-              <w:t>Not fitted; no respondent-level rows</w:t>
-            </w:r>
-          </w:p>
-        </w:tc>
-        <w:tc>
-          <w:tcPr>
-            <w:tcW w:type="dxa" w:w="1580"/>
-          </w:tcPr>
-          <w:p>
-            <w:r>
-              <w:t>Not fitted; no respondent-level rows</w:t>
-            </w:r>
-          </w:p>
-        </w:tc>
-        <w:tc>
-          <w:tcPr>
-            <w:tcW w:type="dxa" w:w="1604"/>
-          </w:tcPr>
-          <w:p>
-            <w:r>
-              <w:t>Not fitted; no respondent-level rows</w:t>
-            </w:r>
-          </w:p>
-        </w:tc>
-        <w:tc>
-          <w:tcPr>
-            <w:tcW w:type="dxa" w:w="2133"/>
-          </w:tcPr>
-          <w:p>
-            <w:r>
-              <w:t>Not fitted; outcome rows unavailable</w:t>
-            </w:r>
-          </w:p>
-        </w:tc>
-      </w:tr>
-      <w:tr>
-        <w:tc>
-          <w:tcPr>
-            <w:tcW w:type="dxa" w:w="2567"/>
-          </w:tcPr>
-          <w:p>
-            <w:r>
-              <w:t>Ridge_raw</w:t>
-            </w:r>
-          </w:p>
-        </w:tc>
-        <w:tc>
-          <w:tcPr>
-            <w:tcW w:type="dxa" w:w="1460"/>
-          </w:tcPr>
-          <w:p>
-            <w:r>
-              <w:t>Not fitted; no respondent-level rows</w:t>
-            </w:r>
-          </w:p>
-        </w:tc>
-        <w:tc>
-          <w:tcPr>
-            <w:tcW w:type="dxa" w:w="1580"/>
-          </w:tcPr>
-          <w:p>
-            <w:r>
-              <w:t>Not fitted; no respondent-level rows</w:t>
-            </w:r>
-          </w:p>
-        </w:tc>
-        <w:tc>
-          <w:tcPr>
-            <w:tcW w:type="dxa" w:w="1604"/>
-          </w:tcPr>
-          <w:p>
-            <w:r>
-              <w:t>Not fitted; no respondent-level rows</w:t>
-            </w:r>
-          </w:p>
-        </w:tc>
-        <w:tc>
-          <w:tcPr>
-            <w:tcW w:type="dxa" w:w="2133"/>
-          </w:tcPr>
-          <w:p>
-            <w:r>
-              <w:t>Not fitted; outcome rows unavailable</w:t>
-            </w:r>
-          </w:p>
-        </w:tc>
-      </w:tr>
-      <w:tr>
-        <w:tc>
-          <w:tcPr>
-            <w:tcW w:type="dxa" w:w="2567"/>
-          </w:tcPr>
-          <w:p>
-            <w:r>
-              <w:t>Ridge_oof_te</w:t>
-            </w:r>
-          </w:p>
-        </w:tc>
-        <w:tc>
-          <w:tcPr>
-            <w:tcW w:type="dxa" w:w="1460"/>
-          </w:tcPr>
-          <w:p>
-            <w:r>
-              <w:t>Not fitted; no respondent-level rows</w:t>
-            </w:r>
-          </w:p>
-        </w:tc>
-        <w:tc>
-          <w:tcPr>
-            <w:tcW w:type="dxa" w:w="1580"/>
-          </w:tcPr>
-          <w:p>
-            <w:r>
-              <w:t>Not fitted; no respondent-level rows</w:t>
-            </w:r>
-          </w:p>
-        </w:tc>
-        <w:tc>
-          <w:tcPr>
-            <w:tcW w:type="dxa" w:w="1604"/>
-          </w:tcPr>
-          <w:p>
-            <w:r>
-              <w:t>Not fitted; no respondent-level rows</w:t>
-            </w:r>
-          </w:p>
-        </w:tc>
-        <w:tc>
-          <w:tcPr>
-            <w:tcW w:type="dxa" w:w="2133"/>
-          </w:tcPr>
-          <w:p>
-            <w:r>
-              <w:t>Not fitted; outcome rows unavailable</w:t>
-            </w:r>
-          </w:p>
-        </w:tc>
-      </w:tr>
-    </w:tbl>
-    <w:p>
-      <w:pPr>
-        <w:spacing w:after="0" w:line="240" w:lineRule="auto"/>
-        <w:rPr>
-          <w:rFonts w:ascii="Times New Roman" w:eastAsia="Times New Roman" w:hAnsi="Times New Roman" w:cs="Times New Roman"/>
-          <w:sz w:val="24"/>
-          <w:szCs w:val="24"/>
-        </w:rPr>
-      </w:pPr>
-    </w:p>
-    <w:p>
-      <w:pPr>
-        <w:spacing w:after="0" w:line="240" w:lineRule="auto"/>
-        <w:rPr>
-          <w:rFonts w:ascii="Times New Roman" w:eastAsia="Times New Roman" w:hAnsi="Times New Roman" w:cs="Times New Roman"/>
-          <w:sz w:val="24"/>
-          <w:szCs w:val="24"/>
-        </w:rPr>
-      </w:pPr>
-      <w:r>
-        <w:t>The six rows define the planned comparisons only. They are not results or a completed ablation.</w:t>
-      </w:r>
-    </w:p>
-    <w:p>
-      <w:pPr>
-        <w:spacing w:after="0" w:line="240" w:lineRule="auto"/>
-        <w:rPr>
-          <w:rFonts w:ascii="Times New Roman" w:eastAsia="Times New Roman" w:hAnsi="Times New Roman" w:cs="Times New Roman"/>
-          <w:sz w:val="24"/>
-          <w:szCs w:val="24"/>
-        </w:rPr>
-      </w:pPr>
-      <w:r>
-        <w:rPr>
-          <w:rFonts w:ascii="Times New Roman" w:eastAsia="Times New Roman" w:hAnsi="Times New Roman" w:cs="Times New Roman"/>
-          <w:sz w:val="24"/>
-          <w:szCs w:val="24"/>
-        </w:rPr>
-        <w:br/>
+      </w:pPr>
+      <w:r>
+        <w:t>R6. Feature Importance and Sparsity: Not Estimated</w:t>
+      </w:r>
+    </w:p>
+    <w:p>
+      <w:pPr>
+        <w:spacing w:after="0" w:line="240" w:lineRule="auto"/>
+        <w:rPr>
+          <w:rFonts w:ascii="Times New Roman" w:eastAsia="Times New Roman" w:hAnsi="Times New Roman" w:cs="Times New Roman"/>
+          <w:sz w:val="24"/>
+          <w:szCs w:val="24"/>
+        </w:rPr>
+      </w:pPr>
+      <w:r>
+        <w:t>No coefficient or sparsity result is available. The selected workbook contains no fitted coefficients, and its marginal counts cannot establish an exact-zero coefficient count.</w:t>
       </w:r>
     </w:p>
     <w:p>
@@ -7923,797 +5460,22 @@
           <w:sz w:val="27"/>
           <w:szCs w:val="27"/>
         </w:rPr>
-        <w:t>R6. Feature Importance and Parameter Sparsity</w:t>
-      </w:r>
-    </w:p>
-    <w:p>
-      <w:pPr>
-        <w:spacing w:after="0" w:line="240" w:lineRule="auto"/>
-        <w:rPr>
-          <w:rFonts w:ascii="Times New Roman" w:eastAsia="Times New Roman" w:hAnsi="Times New Roman" w:cs="Times New Roman"/>
-          <w:sz w:val="24"/>
-          <w:szCs w:val="24"/>
-        </w:rPr>
-      </w:pPr>
-      <w:r>
-        <w:t>No coefficient or sparsity result is available. The selected workbook contains no fitted coefficients, and its marginal counts cannot establish an exact-zero coefficient count.</w:t>
-      </w:r>
-    </w:p>
-    <w:p>
-      <w:pPr>
-        <w:spacing w:after="0" w:line="240" w:lineRule="auto"/>
-        <w:rPr>
-          <w:rFonts w:ascii="Times New Roman" w:eastAsia="Times New Roman" w:hAnsi="Times New Roman" w:cs="Times New Roman"/>
-          <w:sz w:val="24"/>
-          <w:szCs w:val="24"/>
-        </w:rPr>
-      </w:pPr>
-    </w:p>
-    <w:p>
-      <w:r>
-        <w:drawing>
-          <wp:inline xmlns:a="http://schemas.openxmlformats.org/drawingml/2006/main" xmlns:pic="http://schemas.openxmlformats.org/drawingml/2006/picture">
-            <wp:extent cx="5760720" cy="2394906"/>
-            <wp:docPr id="5" name="Picture 5"/>
-            <wp:cNvGraphicFramePr>
-              <a:graphicFrameLocks noChangeAspect="1"/>
-            </wp:cNvGraphicFramePr>
-            <a:graphic>
-              <a:graphicData uri="http://schemas.openxmlformats.org/drawingml/2006/picture">
-                <pic:pic>
-                  <pic:nvPicPr>
-                    <pic:cNvPr id="0" name="g10fig5.png"/>
-                    <pic:cNvPicPr/>
-                  </pic:nvPicPr>
-                  <pic:blipFill>
-                    <a:blip r:embed="rId11"/>
-                    <a:stretch>
-                      <a:fillRect/>
-                    </a:stretch>
-                  </pic:blipFill>
-                  <pic:spPr>
-                    <a:xfrm>
-                      <a:off x="0" y="0"/>
-                      <a:ext cx="5760720" cy="2394906"/>
-                    </a:xfrm>
-                    <a:prstGeom prst="rect"/>
-                  </pic:spPr>
-                </pic:pic>
-              </a:graphicData>
-            </a:graphic>
-          </wp:inline>
-        </w:drawing>
-      </w:r>
-    </w:p>
-    <w:p>
-      <w:r>
-        <w:t>Figure 5. Penalty-path results are unavailable because no LASSO model can be fitted from the selected workbook.</w:t>
-      </w:r>
-    </w:p>
-    <w:p>
-      <w:pPr>
-        <w:spacing w:after="0" w:line="240" w:lineRule="auto"/>
-        <w:rPr>
-          <w:rFonts w:ascii="Times New Roman" w:eastAsia="Times New Roman" w:hAnsi="Times New Roman" w:cs="Times New Roman"/>
-          <w:sz w:val="24"/>
-          <w:szCs w:val="24"/>
-        </w:rPr>
-      </w:pPr>
-      <w:r>
-        <w:t>Table 5. Coefficients and Exact-Zero Count (not estimable from aggregate counts)</w:t>
-      </w:r>
-    </w:p>
-    <w:tbl>
-      <w:tblPr>
-        <w:tblW w:w="0" w:type="auto"/>
-        <w:tblCellSpacing w:w="15" w:type="dxa"/>
-        <w:tblCellMar>
-          <w:top w:w="15" w:type="dxa"/>
-          <w:left w:w="15" w:type="dxa"/>
-          <w:bottom w:w="15" w:type="dxa"/>
-          <w:right w:w="15" w:type="dxa"/>
-        </w:tblCellMar>
-        <w:tblLook w:val="04A0" w:firstRow="1" w:lastRow="0" w:firstColumn="1" w:lastColumn="0" w:noHBand="0" w:noVBand="1"/>
-      </w:tblPr>
-      <w:tblGrid>
-        <w:gridCol w:w="3300"/>
-        <w:gridCol w:w="2661"/>
-        <w:gridCol w:w="3383"/>
-      </w:tblGrid>
-      <w:tr>
-        <w:trPr>
-          <w:tblHeader/>
-          <w:tblCellSpacing w:w="15" w:type="dxa"/>
-        </w:trPr>
-        <w:tc>
-          <w:tcPr>
-            <w:tcW w:w="0" w:type="auto"/>
-            <w:tcBorders>
-              <w:top w:val="single" w:sz="6" w:space="0" w:color="C4C7C5"/>
-              <w:left w:val="single" w:sz="6" w:space="0" w:color="C4C7C5"/>
-              <w:bottom w:val="single" w:sz="6" w:space="0" w:color="C4C7C5"/>
-              <w:right w:val="single" w:sz="6" w:space="0" w:color="C4C7C5"/>
-            </w:tcBorders>
-            <w:tcMar>
-              <w:top w:w="120" w:type="dxa"/>
-              <w:left w:w="180" w:type="dxa"/>
-              <w:bottom w:w="120" w:type="dxa"/>
-              <w:right w:w="180" w:type="dxa"/>
-            </w:tcMar>
-            <w:vAlign w:val="center"/>
-            <w:hideMark/>
-          </w:tcPr>
-          <w:p>
-            <w:r>
-              <w:t>Feature</w:t>
-            </w:r>
-          </w:p>
-        </w:tc>
-        <w:tc>
-          <w:tcPr>
-            <w:tcW w:w="0" w:type="auto"/>
-            <w:tcBorders>
-              <w:top w:val="single" w:sz="6" w:space="0" w:color="C4C7C5"/>
-              <w:left w:val="single" w:sz="6" w:space="0" w:color="C4C7C5"/>
-              <w:bottom w:val="single" w:sz="6" w:space="0" w:color="C4C7C5"/>
-              <w:right w:val="single" w:sz="6" w:space="0" w:color="C4C7C5"/>
-            </w:tcBorders>
-            <w:tcMar>
-              <w:top w:w="120" w:type="dxa"/>
-              <w:left w:w="180" w:type="dxa"/>
-              <w:bottom w:w="120" w:type="dxa"/>
-              <w:right w:w="180" w:type="dxa"/>
-            </w:tcMar>
-            <w:vAlign w:val="center"/>
-            <w:hideMark/>
-          </w:tcPr>
-          <w:p>
-            <w:r>
-              <w:t>OLS OOF-TE coefficient</w:t>
-            </w:r>
-          </w:p>
-        </w:tc>
-        <w:tc>
-          <w:tcPr>
-            <w:tcW w:w="0" w:type="auto"/>
-            <w:tcBorders>
-              <w:top w:val="single" w:sz="6" w:space="0" w:color="C4C7C5"/>
-              <w:left w:val="single" w:sz="6" w:space="0" w:color="C4C7C5"/>
-              <w:bottom w:val="single" w:sz="6" w:space="0" w:color="C4C7C5"/>
-              <w:right w:val="single" w:sz="6" w:space="0" w:color="C4C7C5"/>
-            </w:tcBorders>
-            <w:tcMar>
-              <w:top w:w="120" w:type="dxa"/>
-              <w:left w:w="180" w:type="dxa"/>
-              <w:bottom w:w="120" w:type="dxa"/>
-              <w:right w:w="180" w:type="dxa"/>
-            </w:tcMar>
-            <w:vAlign w:val="center"/>
-            <w:hideMark/>
-          </w:tcPr>
-          <w:p>
-            <w:r>
-              <w:t>LASSO OOF-TE coefficient</w:t>
-            </w:r>
-          </w:p>
-        </w:tc>
-      </w:tr>
-      <w:tr>
-        <w:trPr>
-          <w:tblCellSpacing w:w="15" w:type="dxa"/>
-        </w:trPr>
-        <w:tc>
-          <w:tcPr>
-            <w:tcW w:w="0" w:type="auto"/>
-            <w:tcBorders>
-              <w:top w:val="single" w:sz="6" w:space="0" w:color="C4C7C5"/>
-              <w:left w:val="single" w:sz="6" w:space="0" w:color="C4C7C5"/>
-              <w:bottom w:val="single" w:sz="6" w:space="0" w:color="C4C7C5"/>
-              <w:right w:val="single" w:sz="6" w:space="0" w:color="C4C7C5"/>
-            </w:tcBorders>
-            <w:tcMar>
-              <w:top w:w="120" w:type="dxa"/>
-              <w:left w:w="180" w:type="dxa"/>
-              <w:bottom w:w="120" w:type="dxa"/>
-              <w:right w:w="180" w:type="dxa"/>
-            </w:tcMar>
-            <w:vAlign w:val="center"/>
-            <w:hideMark/>
-          </w:tcPr>
-          <w:p>
-            <w:r>
-              <w:t>study_level</w:t>
-            </w:r>
-          </w:p>
-        </w:tc>
-        <w:tc>
-          <w:tcPr>
-            <w:tcW w:w="0" w:type="auto"/>
-            <w:tcBorders>
-              <w:top w:val="single" w:sz="6" w:space="0" w:color="C4C7C5"/>
-              <w:left w:val="single" w:sz="6" w:space="0" w:color="C4C7C5"/>
-              <w:bottom w:val="single" w:sz="6" w:space="0" w:color="C4C7C5"/>
-              <w:right w:val="single" w:sz="6" w:space="0" w:color="C4C7C5"/>
-            </w:tcBorders>
-            <w:tcMar>
-              <w:top w:w="120" w:type="dxa"/>
-              <w:left w:w="180" w:type="dxa"/>
-              <w:bottom w:w="120" w:type="dxa"/>
-              <w:right w:w="180" w:type="dxa"/>
-            </w:tcMar>
-            <w:vAlign w:val="center"/>
-            <w:hideMark/>
-          </w:tcPr>
-          <w:p>
-            <w:r>
-              <w:t>Not estimable from aggregate counts</w:t>
-            </w:r>
-          </w:p>
-        </w:tc>
-        <w:tc>
-          <w:tcPr>
-            <w:tcW w:w="0" w:type="auto"/>
-            <w:tcBorders>
-              <w:top w:val="single" w:sz="6" w:space="0" w:color="C4C7C5"/>
-              <w:left w:val="single" w:sz="6" w:space="0" w:color="C4C7C5"/>
-              <w:bottom w:val="single" w:sz="6" w:space="0" w:color="C4C7C5"/>
-              <w:right w:val="single" w:sz="6" w:space="0" w:color="C4C7C5"/>
-            </w:tcBorders>
-            <w:tcMar>
-              <w:top w:w="120" w:type="dxa"/>
-              <w:left w:w="180" w:type="dxa"/>
-              <w:bottom w:w="120" w:type="dxa"/>
-              <w:right w:w="180" w:type="dxa"/>
-            </w:tcMar>
-            <w:vAlign w:val="center"/>
-            <w:hideMark/>
-          </w:tcPr>
-          <w:p>
-            <w:r>
-              <w:t>Not estimable from aggregate counts</w:t>
-            </w:r>
-          </w:p>
-        </w:tc>
-      </w:tr>
-      <w:tr>
-        <w:trPr>
-          <w:tblCellSpacing w:w="15" w:type="dxa"/>
-        </w:trPr>
-        <w:tc>
-          <w:tcPr>
-            <w:tcW w:w="0" w:type="auto"/>
-            <w:tcBorders>
-              <w:top w:val="single" w:sz="6" w:space="0" w:color="C4C7C5"/>
-              <w:left w:val="single" w:sz="6" w:space="0" w:color="C4C7C5"/>
-              <w:bottom w:val="single" w:sz="6" w:space="0" w:color="C4C7C5"/>
-              <w:right w:val="single" w:sz="6" w:space="0" w:color="C4C7C5"/>
-            </w:tcBorders>
-            <w:tcMar>
-              <w:top w:w="120" w:type="dxa"/>
-              <w:left w:w="180" w:type="dxa"/>
-              <w:bottom w:w="120" w:type="dxa"/>
-              <w:right w:w="180" w:type="dxa"/>
-            </w:tcMar>
-            <w:vAlign w:val="center"/>
-            <w:hideMark/>
-          </w:tcPr>
-          <w:p>
-            <w:r>
-              <w:t>age_group</w:t>
-            </w:r>
-          </w:p>
-        </w:tc>
-        <w:tc>
-          <w:tcPr>
-            <w:tcW w:w="0" w:type="auto"/>
-            <w:tcBorders>
-              <w:top w:val="single" w:sz="6" w:space="0" w:color="C4C7C5"/>
-              <w:left w:val="single" w:sz="6" w:space="0" w:color="C4C7C5"/>
-              <w:bottom w:val="single" w:sz="6" w:space="0" w:color="C4C7C5"/>
-              <w:right w:val="single" w:sz="6" w:space="0" w:color="C4C7C5"/>
-            </w:tcBorders>
-            <w:tcMar>
-              <w:top w:w="120" w:type="dxa"/>
-              <w:left w:w="180" w:type="dxa"/>
-              <w:bottom w:w="120" w:type="dxa"/>
-              <w:right w:w="180" w:type="dxa"/>
-            </w:tcMar>
-            <w:vAlign w:val="center"/>
-            <w:hideMark/>
-          </w:tcPr>
-          <w:p>
-            <w:r>
-              <w:t>Not estimable from aggregate counts</w:t>
-            </w:r>
-          </w:p>
-        </w:tc>
-        <w:tc>
-          <w:tcPr>
-            <w:tcW w:w="0" w:type="auto"/>
-            <w:tcBorders>
-              <w:top w:val="single" w:sz="6" w:space="0" w:color="C4C7C5"/>
-              <w:left w:val="single" w:sz="6" w:space="0" w:color="C4C7C5"/>
-              <w:bottom w:val="single" w:sz="6" w:space="0" w:color="C4C7C5"/>
-              <w:right w:val="single" w:sz="6" w:space="0" w:color="C4C7C5"/>
-            </w:tcBorders>
-            <w:tcMar>
-              <w:top w:w="120" w:type="dxa"/>
-              <w:left w:w="180" w:type="dxa"/>
-              <w:bottom w:w="120" w:type="dxa"/>
-              <w:right w:w="180" w:type="dxa"/>
-            </w:tcMar>
-            <w:vAlign w:val="center"/>
-            <w:hideMark/>
-          </w:tcPr>
-          <w:p>
-            <w:r>
-              <w:t>Not estimable from aggregate counts</w:t>
-            </w:r>
-          </w:p>
-        </w:tc>
-      </w:tr>
-      <w:tr>
-        <w:trPr>
-          <w:tblCellSpacing w:w="15" w:type="dxa"/>
-        </w:trPr>
-        <w:tc>
-          <w:tcPr>
-            <w:tcW w:w="0" w:type="auto"/>
-            <w:tcBorders>
-              <w:top w:val="single" w:sz="6" w:space="0" w:color="C4C7C5"/>
-              <w:left w:val="single" w:sz="6" w:space="0" w:color="C4C7C5"/>
-              <w:bottom w:val="single" w:sz="6" w:space="0" w:color="C4C7C5"/>
-              <w:right w:val="single" w:sz="6" w:space="0" w:color="C4C7C5"/>
-            </w:tcBorders>
-            <w:tcMar>
-              <w:top w:w="120" w:type="dxa"/>
-              <w:left w:w="180" w:type="dxa"/>
-              <w:bottom w:w="120" w:type="dxa"/>
-              <w:right w:w="180" w:type="dxa"/>
-            </w:tcMar>
-            <w:vAlign w:val="center"/>
-            <w:hideMark/>
-          </w:tcPr>
-          <w:p>
-            <w:r>
-              <w:t>gender</w:t>
-            </w:r>
-          </w:p>
-        </w:tc>
-        <w:tc>
-          <w:tcPr>
-            <w:tcW w:w="0" w:type="auto"/>
-            <w:tcBorders>
-              <w:top w:val="single" w:sz="6" w:space="0" w:color="C4C7C5"/>
-              <w:left w:val="single" w:sz="6" w:space="0" w:color="C4C7C5"/>
-              <w:bottom w:val="single" w:sz="6" w:space="0" w:color="C4C7C5"/>
-              <w:right w:val="single" w:sz="6" w:space="0" w:color="C4C7C5"/>
-            </w:tcBorders>
-            <w:tcMar>
-              <w:top w:w="120" w:type="dxa"/>
-              <w:left w:w="180" w:type="dxa"/>
-              <w:bottom w:w="120" w:type="dxa"/>
-              <w:right w:w="180" w:type="dxa"/>
-            </w:tcMar>
-            <w:vAlign w:val="center"/>
-            <w:hideMark/>
-          </w:tcPr>
-          <w:p>
-            <w:r>
-              <w:t>Not estimable from aggregate counts</w:t>
-            </w:r>
-          </w:p>
-        </w:tc>
-        <w:tc>
-          <w:tcPr>
-            <w:tcW w:w="0" w:type="auto"/>
-            <w:tcBorders>
-              <w:top w:val="single" w:sz="6" w:space="0" w:color="C4C7C5"/>
-              <w:left w:val="single" w:sz="6" w:space="0" w:color="C4C7C5"/>
-              <w:bottom w:val="single" w:sz="6" w:space="0" w:color="C4C7C5"/>
-              <w:right w:val="single" w:sz="6" w:space="0" w:color="C4C7C5"/>
-            </w:tcBorders>
-            <w:tcMar>
-              <w:top w:w="120" w:type="dxa"/>
-              <w:left w:w="180" w:type="dxa"/>
-              <w:bottom w:w="120" w:type="dxa"/>
-              <w:right w:w="180" w:type="dxa"/>
-            </w:tcMar>
-            <w:vAlign w:val="center"/>
-            <w:hideMark/>
-          </w:tcPr>
-          <w:p>
-            <w:r>
-              <w:t>Not estimable from aggregate counts</w:t>
-            </w:r>
-          </w:p>
-        </w:tc>
-      </w:tr>
-      <w:tr>
-        <w:tc>
-          <w:tcPr>
-            <w:tcW w:type="dxa" w:w="3300"/>
-          </w:tcPr>
-          <w:p>
-            <w:r>
-              <w:t>computer_confidence</w:t>
-            </w:r>
-          </w:p>
-        </w:tc>
-        <w:tc>
-          <w:tcPr>
-            <w:tcW w:type="dxa" w:w="2661"/>
-          </w:tcPr>
-          <w:p>
-            <w:r>
-              <w:t>Not estimable from aggregate counts</w:t>
-            </w:r>
-          </w:p>
-        </w:tc>
-        <w:tc>
-          <w:tcPr>
-            <w:tcW w:type="dxa" w:w="3383"/>
-          </w:tcPr>
-          <w:p>
-            <w:r>
-              <w:t>Not estimable from aggregate counts</w:t>
-            </w:r>
-          </w:p>
-        </w:tc>
-      </w:tr>
-      <w:tr>
-        <w:tc>
-          <w:tcPr>
-            <w:tcW w:type="dxa" w:w="3300"/>
-          </w:tcPr>
-          <w:p>
-            <w:r>
-              <w:t>CA1</w:t>
-            </w:r>
-          </w:p>
-        </w:tc>
-        <w:tc>
-          <w:tcPr>
-            <w:tcW w:type="dxa" w:w="2661"/>
-          </w:tcPr>
-          <w:p>
-            <w:r>
-              <w:t>Not estimable from aggregate counts</w:t>
-            </w:r>
-          </w:p>
-        </w:tc>
-        <w:tc>
-          <w:tcPr>
-            <w:tcW w:type="dxa" w:w="3383"/>
-          </w:tcPr>
-          <w:p>
-            <w:r>
-              <w:t>Not estimable from aggregate counts</w:t>
-            </w:r>
-          </w:p>
-        </w:tc>
-      </w:tr>
-      <w:tr>
-        <w:tc>
-          <w:tcPr>
-            <w:tcW w:type="dxa" w:w="3300"/>
-          </w:tcPr>
-          <w:p>
-            <w:r>
-              <w:t>CA2</w:t>
-            </w:r>
-          </w:p>
-        </w:tc>
-        <w:tc>
-          <w:tcPr>
-            <w:tcW w:type="dxa" w:w="2661"/>
-          </w:tcPr>
-          <w:p>
-            <w:r>
-              <w:t>Not estimable from aggregate counts</w:t>
-            </w:r>
-          </w:p>
-        </w:tc>
-        <w:tc>
-          <w:tcPr>
-            <w:tcW w:type="dxa" w:w="3383"/>
-          </w:tcPr>
-          <w:p>
-            <w:r>
-              <w:t>Not estimable from aggregate counts</w:t>
-            </w:r>
-          </w:p>
-        </w:tc>
-      </w:tr>
-      <w:tr>
-        <w:tc>
-          <w:tcPr>
-            <w:tcW w:type="dxa" w:w="3300"/>
-          </w:tcPr>
-          <w:p>
-            <w:r>
-              <w:t>CA3</w:t>
-            </w:r>
-          </w:p>
-        </w:tc>
-        <w:tc>
-          <w:tcPr>
-            <w:tcW w:type="dxa" w:w="2661"/>
-          </w:tcPr>
-          <w:p>
-            <w:r>
-              <w:t>Not estimable from aggregate counts</w:t>
-            </w:r>
-          </w:p>
-        </w:tc>
-        <w:tc>
-          <w:tcPr>
-            <w:tcW w:type="dxa" w:w="3383"/>
-          </w:tcPr>
-          <w:p>
-            <w:r>
-              <w:t>Not estimable from aggregate counts</w:t>
-            </w:r>
-          </w:p>
-        </w:tc>
-      </w:tr>
-      <w:tr>
-        <w:tc>
-          <w:tcPr>
-            <w:tcW w:type="dxa" w:w="3300"/>
-          </w:tcPr>
-          <w:p>
-            <w:r>
-              <w:t>CA4</w:t>
-            </w:r>
-          </w:p>
-        </w:tc>
-        <w:tc>
-          <w:tcPr>
-            <w:tcW w:type="dxa" w:w="2661"/>
-          </w:tcPr>
-          <w:p>
-            <w:r>
-              <w:t>Not estimable from aggregate counts</w:t>
-            </w:r>
-          </w:p>
-        </w:tc>
-        <w:tc>
-          <w:tcPr>
-            <w:tcW w:type="dxa" w:w="3383"/>
-          </w:tcPr>
-          <w:p>
-            <w:r>
-              <w:t>Not estimable from aggregate counts</w:t>
-            </w:r>
-          </w:p>
-        </w:tc>
-      </w:tr>
-      <w:tr>
-        <w:tc>
-          <w:tcPr>
-            <w:tcW w:type="dxa" w:w="3300"/>
-          </w:tcPr>
-          <w:p>
-            <w:r>
-              <w:t>CA5</w:t>
-            </w:r>
-          </w:p>
-        </w:tc>
-        <w:tc>
-          <w:tcPr>
-            <w:tcW w:type="dxa" w:w="2661"/>
-          </w:tcPr>
-          <w:p>
-            <w:r>
-              <w:t>Not estimable from aggregate counts</w:t>
-            </w:r>
-          </w:p>
-        </w:tc>
-        <w:tc>
-          <w:tcPr>
-            <w:tcW w:type="dxa" w:w="3383"/>
-          </w:tcPr>
-          <w:p>
-            <w:r>
-              <w:t>Not estimable from aggregate counts</w:t>
-            </w:r>
-          </w:p>
-        </w:tc>
-      </w:tr>
-      <w:tr>
-        <w:tc>
-          <w:tcPr>
-            <w:tcW w:type="dxa" w:w="3300"/>
-          </w:tcPr>
-          <w:p>
-            <w:r>
-              <w:t>CA6</w:t>
-            </w:r>
-          </w:p>
-        </w:tc>
-        <w:tc>
-          <w:tcPr>
-            <w:tcW w:type="dxa" w:w="2661"/>
-          </w:tcPr>
-          <w:p>
-            <w:r>
-              <w:t>Not estimable from aggregate counts</w:t>
-            </w:r>
-          </w:p>
-        </w:tc>
-        <w:tc>
-          <w:tcPr>
-            <w:tcW w:type="dxa" w:w="3383"/>
-          </w:tcPr>
-          <w:p>
-            <w:r>
-              <w:t>Not estimable from aggregate counts</w:t>
-            </w:r>
-          </w:p>
-        </w:tc>
-      </w:tr>
-      <w:tr>
-        <w:tc>
-          <w:tcPr>
-            <w:tcW w:type="dxa" w:w="3300"/>
-          </w:tcPr>
-          <w:p>
-            <w:r>
-              <w:t>CA7</w:t>
-            </w:r>
-          </w:p>
-        </w:tc>
-        <w:tc>
-          <w:tcPr>
-            <w:tcW w:type="dxa" w:w="2661"/>
-          </w:tcPr>
-          <w:p>
-            <w:r>
-              <w:t>Not estimable from aggregate counts</w:t>
-            </w:r>
-          </w:p>
-        </w:tc>
-        <w:tc>
-          <w:tcPr>
-            <w:tcW w:type="dxa" w:w="3383"/>
-          </w:tcPr>
-          <w:p>
-            <w:r>
-              <w:t>Not estimable from aggregate counts</w:t>
-            </w:r>
-          </w:p>
-        </w:tc>
-      </w:tr>
-      <w:tr>
-        <w:tc>
-          <w:tcPr>
-            <w:tcW w:type="dxa" w:w="3300"/>
-          </w:tcPr>
-          <w:p>
-            <w:r>
-              <w:t>CA8</w:t>
-            </w:r>
-          </w:p>
-        </w:tc>
-        <w:tc>
-          <w:tcPr>
-            <w:tcW w:type="dxa" w:w="2661"/>
-          </w:tcPr>
-          <w:p>
-            <w:r>
-              <w:t>Not estimable from aggregate counts</w:t>
-            </w:r>
-          </w:p>
-        </w:tc>
-        <w:tc>
-          <w:tcPr>
-            <w:tcW w:type="dxa" w:w="3383"/>
-          </w:tcPr>
-          <w:p>
-            <w:r>
-              <w:t>Not estimable from aggregate counts</w:t>
-            </w:r>
-          </w:p>
-        </w:tc>
-      </w:tr>
-      <w:tr>
-        <w:tc>
-          <w:tcPr>
-            <w:tcW w:type="dxa" w:w="3300"/>
-          </w:tcPr>
-          <w:p>
-            <w:r>
-              <w:t>CA9</w:t>
-            </w:r>
-          </w:p>
-        </w:tc>
-        <w:tc>
-          <w:tcPr>
-            <w:tcW w:type="dxa" w:w="2661"/>
-          </w:tcPr>
-          <w:p>
-            <w:r>
-              <w:t>Not estimable from aggregate counts</w:t>
-            </w:r>
-          </w:p>
-        </w:tc>
-        <w:tc>
-          <w:tcPr>
-            <w:tcW w:type="dxa" w:w="3383"/>
-          </w:tcPr>
-          <w:p>
-            <w:r>
-              <w:t>Not estimable from aggregate counts</w:t>
-            </w:r>
-          </w:p>
-        </w:tc>
-      </w:tr>
-      <w:tr>
-        <w:tc>
-          <w:tcPr>
-            <w:tcW w:type="dxa" w:w="3300"/>
-          </w:tcPr>
-          <w:p>
-            <w:r>
-              <w:t>Exact-zero count (k of 13 Excel-visible candidate predictors)</w:t>
-            </w:r>
-          </w:p>
-        </w:tc>
-        <w:tc>
-          <w:tcPr>
-            <w:tcW w:type="dxa" w:w="2661"/>
-          </w:tcPr>
-          <w:p>
-            <w:r>
-              <w:t>Not estimable; no fitted OLS model</w:t>
-            </w:r>
-          </w:p>
-        </w:tc>
-        <w:tc>
-          <w:tcPr>
-            <w:tcW w:type="dxa" w:w="3383"/>
-          </w:tcPr>
-          <w:p>
-            <w:r>
-              <w:t>Not estimable; no fitted LASSO model</w:t>
-            </w:r>
-          </w:p>
-        </w:tc>
-      </w:tr>
-      <w:tr>
-        <w:tc>
-          <w:tcPr>
-            <w:tcW w:type="dxa" w:w="3300"/>
-          </w:tcPr>
-          <w:p>
-            <w:r>
-              <w:t>School/site grouping</w:t>
-            </w:r>
-          </w:p>
-        </w:tc>
-        <w:tc>
-          <w:tcPr>
-            <w:tcW w:type="dxa" w:w="2661"/>
-          </w:tcPr>
-          <w:p>
-            <w:r>
-              <w:t>Not respondent-linked in workbook</w:t>
-            </w:r>
-          </w:p>
-        </w:tc>
-        <w:tc>
-          <w:tcPr>
-            <w:tcW w:type="dxa" w:w="3383"/>
-          </w:tcPr>
-          <w:p>
-            <w:r>
-              <w:t>Not respondent-linked in workbook</w:t>
-            </w:r>
-          </w:p>
-        </w:tc>
-      </w:tr>
-    </w:tbl>
+        <w:t>R7. Error Analysis and Residual Profile</w:t>
+      </w:r>
+    </w:p>
+    <w:p>
+      <w:pPr>
+        <w:spacing w:after="0" w:line="240" w:lineRule="auto"/>
+        <w:rPr>
+          <w:rFonts w:ascii="Times New Roman" w:eastAsia="Times New Roman" w:hAnsi="Times New Roman" w:cs="Times New Roman"/>
+          <w:sz w:val="24"/>
+          <w:szCs w:val="24"/>
+        </w:rPr>
+      </w:pPr>
+      <w:r>
+        <w:t>No out-of-fold predictions or residuals are available. Individual residual summaries, deciles, and school-level errors cannot be recovered from marginal frequencies.</w:t>
+      </w:r>
+    </w:p>
     <w:p>
       <w:pPr>
         <w:spacing w:after="0" w:line="240" w:lineRule="auto"/>
@@ -8752,20 +5514,42 @@
           <w:sz w:val="27"/>
           <w:szCs w:val="27"/>
         </w:rPr>
-        <w:t>R7. Error Analysis and Residual Profile</w:t>
-      </w:r>
-    </w:p>
-    <w:p>
-      <w:pPr>
-        <w:spacing w:after="0" w:line="240" w:lineRule="auto"/>
-        <w:rPr>
-          <w:rFonts w:ascii="Times New Roman" w:eastAsia="Times New Roman" w:hAnsi="Times New Roman" w:cs="Times New Roman"/>
-          <w:sz w:val="24"/>
-          <w:szCs w:val="24"/>
-        </w:rPr>
-      </w:pPr>
-      <w:r>
-        <w:t>No out-of-fold predictions or residuals are available. Individual residual summaries, deciles, and school-level errors cannot be recovered from marginal frequencies.</w:t>
+        <w:t xml:space="preserve">R8. Transfer or </w:t>
+      </w:r>
+      <w:proofErr w:type="spellStart"/>
+      <w:r>
+        <w:rPr>
+          <w:rFonts w:ascii="Times New Roman" w:eastAsia="Times New Roman" w:hAnsi="Times New Roman" w:cs="Times New Roman"/>
+          <w:b/>
+          <w:bCs/>
+          <w:sz w:val="27"/>
+          <w:szCs w:val="27"/>
+        </w:rPr>
+        <w:t>Generalisation</w:t>
+      </w:r>
+      <w:proofErr w:type="spellEnd"/>
+      <w:r>
+        <w:rPr>
+          <w:rFonts w:ascii="Times New Roman" w:eastAsia="Times New Roman" w:hAnsi="Times New Roman" w:cs="Times New Roman"/>
+          <w:b/>
+          <w:bCs/>
+          <w:sz w:val="27"/>
+          <w:szCs w:val="27"/>
+        </w:rPr>
+        <w:t xml:space="preserve"> Results</w:t>
+      </w:r>
+    </w:p>
+    <w:p>
+      <w:pPr>
+        <w:spacing w:after="0" w:line="240" w:lineRule="auto"/>
+        <w:rPr>
+          <w:rFonts w:ascii="Times New Roman" w:eastAsia="Times New Roman" w:hAnsi="Times New Roman" w:cs="Times New Roman"/>
+          <w:sz w:val="24"/>
+          <w:szCs w:val="24"/>
+        </w:rPr>
+      </w:pPr>
+      <w:r>
+        <w:t>Transfer beyond the participating sites was not assessed. Site totals alone do not provide respondent-linked groups or external validation.</w:t>
       </w:r>
     </w:p>
     <w:p>
@@ -8806,10 +5590,44 @@
           <w:sz w:val="27"/>
           <w:szCs w:val="27"/>
         </w:rPr>
-        <w:t xml:space="preserve">R8. Transfer or </w:t>
-      </w:r>
-      <w:proofErr w:type="spellStart"/>
-      <w:r>
+        <w:t>R9. Computational Cost</w:t>
+      </w:r>
+    </w:p>
+    <w:p>
+      <w:pPr>
+        <w:spacing w:after="0" w:line="240" w:lineRule="auto"/>
+        <w:rPr>
+          <w:rFonts w:ascii="Times New Roman" w:eastAsia="Times New Roman" w:hAnsi="Times New Roman" w:cs="Times New Roman"/>
+          <w:sz w:val="24"/>
+          <w:szCs w:val="24"/>
+        </w:rPr>
+      </w:pPr>
+      <w:r>
+        <w:t>Training time and inference latency are not reported because no corrected model was fitted.</w:t>
+      </w:r>
+    </w:p>
+    <w:p>
+      <w:pPr>
+        <w:spacing w:after="0" w:line="240" w:lineRule="auto"/>
+        <w:rPr>
+          <w:rFonts w:ascii="Times New Roman" w:eastAsia="Times New Roman" w:hAnsi="Times New Roman" w:cs="Times New Roman"/>
+          <w:sz w:val="24"/>
+          <w:szCs w:val="24"/>
+        </w:rPr>
+      </w:pPr>
+      <w:r>
+        <w:rPr>
+          <w:rFonts w:ascii="Times New Roman" w:eastAsia="Times New Roman" w:hAnsi="Times New Roman" w:cs="Times New Roman"/>
+          <w:sz w:val="24"/>
+          <w:szCs w:val="24"/>
+        </w:rPr>
+        <w:br/>
+      </w:r>
+    </w:p>
+    <w:p>
+      <w:pPr>
+        <w:spacing w:before="100" w:beforeAutospacing="1" w:after="100" w:afterAutospacing="1" w:line="240" w:lineRule="auto"/>
+        <w:outlineLvl w:val="2"/>
         <w:rPr>
           <w:rFonts w:ascii="Times New Roman" w:eastAsia="Times New Roman" w:hAnsi="Times New Roman" w:cs="Times New Roman"/>
           <w:b/>
@@ -8817,9 +5635,7 @@
           <w:sz w:val="27"/>
           <w:szCs w:val="27"/>
         </w:rPr>
-        <w:t>Generalisation</w:t>
-      </w:r>
-      <w:proofErr w:type="spellEnd"/>
+      </w:pPr>
       <w:r>
         <w:rPr>
           <w:rFonts w:ascii="Times New Roman" w:eastAsia="Times New Roman" w:hAnsi="Times New Roman" w:cs="Times New Roman"/>
@@ -8828,114 +5644,6 @@
           <w:sz w:val="27"/>
           <w:szCs w:val="27"/>
         </w:rPr>
-        <w:t xml:space="preserve"> Results</w:t>
-      </w:r>
-    </w:p>
-    <w:p>
-      <w:pPr>
-        <w:spacing w:after="0" w:line="240" w:lineRule="auto"/>
-        <w:rPr>
-          <w:rFonts w:ascii="Times New Roman" w:eastAsia="Times New Roman" w:hAnsi="Times New Roman" w:cs="Times New Roman"/>
-          <w:sz w:val="24"/>
-          <w:szCs w:val="24"/>
-        </w:rPr>
-      </w:pPr>
-      <w:r>
-        <w:t>Transfer beyond the participating sites was not assessed. Site totals alone do not provide respondent-linked groups or external validation.</w:t>
-      </w:r>
-    </w:p>
-    <w:p>
-      <w:pPr>
-        <w:spacing w:after="0" w:line="240" w:lineRule="auto"/>
-        <w:rPr>
-          <w:rFonts w:ascii="Times New Roman" w:eastAsia="Times New Roman" w:hAnsi="Times New Roman" w:cs="Times New Roman"/>
-          <w:sz w:val="24"/>
-          <w:szCs w:val="24"/>
-        </w:rPr>
-      </w:pPr>
-      <w:r>
-        <w:rPr>
-          <w:rFonts w:ascii="Times New Roman" w:eastAsia="Times New Roman" w:hAnsi="Times New Roman" w:cs="Times New Roman"/>
-          <w:sz w:val="24"/>
-          <w:szCs w:val="24"/>
-        </w:rPr>
-        <w:br/>
-      </w:r>
-    </w:p>
-    <w:p>
-      <w:pPr>
-        <w:spacing w:before="100" w:beforeAutospacing="1" w:after="100" w:afterAutospacing="1" w:line="240" w:lineRule="auto"/>
-        <w:outlineLvl w:val="2"/>
-        <w:rPr>
-          <w:rFonts w:ascii="Times New Roman" w:eastAsia="Times New Roman" w:hAnsi="Times New Roman" w:cs="Times New Roman"/>
-          <w:b/>
-          <w:bCs/>
-          <w:sz w:val="27"/>
-          <w:szCs w:val="27"/>
-        </w:rPr>
-      </w:pPr>
-      <w:r>
-        <w:rPr>
-          <w:rFonts w:ascii="Times New Roman" w:eastAsia="Times New Roman" w:hAnsi="Times New Roman" w:cs="Times New Roman"/>
-          <w:b/>
-          <w:bCs/>
-          <w:sz w:val="27"/>
-          <w:szCs w:val="27"/>
-        </w:rPr>
-        <w:t>R9. Computational Cost</w:t>
-      </w:r>
-    </w:p>
-    <w:p>
-      <w:pPr>
-        <w:spacing w:after="0" w:line="240" w:lineRule="auto"/>
-        <w:rPr>
-          <w:rFonts w:ascii="Times New Roman" w:eastAsia="Times New Roman" w:hAnsi="Times New Roman" w:cs="Times New Roman"/>
-          <w:sz w:val="24"/>
-          <w:szCs w:val="24"/>
-        </w:rPr>
-      </w:pPr>
-      <w:r>
-        <w:t>Training time and inference latency are not reported because no corrected model was fitted.</w:t>
-      </w:r>
-    </w:p>
-    <w:p>
-      <w:pPr>
-        <w:spacing w:after="0" w:line="240" w:lineRule="auto"/>
-        <w:rPr>
-          <w:rFonts w:ascii="Times New Roman" w:eastAsia="Times New Roman" w:hAnsi="Times New Roman" w:cs="Times New Roman"/>
-          <w:sz w:val="24"/>
-          <w:szCs w:val="24"/>
-        </w:rPr>
-      </w:pPr>
-      <w:r>
-        <w:rPr>
-          <w:rFonts w:ascii="Times New Roman" w:eastAsia="Times New Roman" w:hAnsi="Times New Roman" w:cs="Times New Roman"/>
-          <w:sz w:val="24"/>
-          <w:szCs w:val="24"/>
-        </w:rPr>
-        <w:br/>
-      </w:r>
-    </w:p>
-    <w:p>
-      <w:pPr>
-        <w:spacing w:before="100" w:beforeAutospacing="1" w:after="100" w:afterAutospacing="1" w:line="240" w:lineRule="auto"/>
-        <w:outlineLvl w:val="2"/>
-        <w:rPr>
-          <w:rFonts w:ascii="Times New Roman" w:eastAsia="Times New Roman" w:hAnsi="Times New Roman" w:cs="Times New Roman"/>
-          <w:b/>
-          <w:bCs/>
-          <w:sz w:val="27"/>
-          <w:szCs w:val="27"/>
-        </w:rPr>
-      </w:pPr>
-      <w:r>
-        <w:rPr>
-          <w:rFonts w:ascii="Times New Roman" w:eastAsia="Times New Roman" w:hAnsi="Times New Roman" w:cs="Times New Roman"/>
-          <w:b/>
-          <w:bCs/>
-          <w:sz w:val="27"/>
-          <w:szCs w:val="27"/>
-        </w:rPr>
         <w:t>R10. Non-Confirmatory and Negative Results</w:t>
       </w:r>
     </w:p>
@@ -8955,7 +5663,7 @@
     <w:p/>
     <w:p>
       <w:r>
-        <w:t>Table 6. Objective-to-Method-to-Evidence Traceability</w:t>
+        <w:t>Table 4. Objective-to-Method-to-Evidence Traceability</w:t>
       </w:r>
     </w:p>
     <w:tbl>

</xml_diff>